<commit_message>
Correction gestion notes sur unions
</commit_message>
<xml_diff>
--- a/doc/NotesNRa7.3_Manips_parsing_Firefox.docx
+++ b/doc/NotesNRa7.3_Manips_parsing_Firefox.docx
@@ -720,69 +720,137 @@
       </w:r>
       <w:proofErr w:type="spellEnd"/>
       <w:r>
+        <w:t>, cwd, env,</w:t>
+      </w:r>
+    </w:p>
+    <w:p>
+      <w:pPr>
+        <w:pStyle w:val="Listing"/>
+      </w:pPr>
+      <w:r>
+        <w:t xml:space="preserve">                        ^^^^^^^^^^^^^^^^^^^</w:t>
+      </w:r>
+    </w:p>
+    <w:p>
+      <w:pPr>
+        <w:pStyle w:val="Listing"/>
+      </w:pPr>
+      <w:r>
+        <w:t xml:space="preserve">    ...&lt;5 </w:t>
+      </w:r>
+      <w:proofErr w:type="spellStart"/>
+      <w:r>
+        <w:t>lines</w:t>
+      </w:r>
+      <w:proofErr w:type="spellEnd"/>
+      <w:r>
+        <w:t>&gt;...</w:t>
+      </w:r>
+    </w:p>
+    <w:p>
+      <w:pPr>
+        <w:pStyle w:val="Listing"/>
+      </w:pPr>
+      <w:r>
+        <w:t xml:space="preserve">                        </w:t>
+      </w:r>
+      <w:proofErr w:type="spellStart"/>
+      <w:proofErr w:type="gramStart"/>
+      <w:r>
+        <w:t>gid</w:t>
+      </w:r>
+      <w:proofErr w:type="spellEnd"/>
+      <w:proofErr w:type="gramEnd"/>
+      <w:r>
+        <w:t>, gids, uid, umask,</w:t>
+      </w:r>
+    </w:p>
+    <w:p>
+      <w:pPr>
+        <w:pStyle w:val="Listing"/>
+      </w:pPr>
+      <w:r>
+        <w:t xml:space="preserve">                        ^^^^^^^^^^^^^^^^^^^^^^</w:t>
+      </w:r>
+    </w:p>
+    <w:p>
+      <w:pPr>
+        <w:pStyle w:val="Listing"/>
+      </w:pPr>
+      <w:r>
+        <w:t xml:space="preserve">                        </w:t>
+      </w:r>
+      <w:proofErr w:type="spellStart"/>
+      <w:proofErr w:type="gramStart"/>
+      <w:r>
+        <w:t>start</w:t>
+      </w:r>
+      <w:proofErr w:type="gramEnd"/>
+      <w:r>
+        <w:t>_new_session</w:t>
+      </w:r>
+      <w:proofErr w:type="spellEnd"/>
+      <w:r>
         <w:t xml:space="preserve">, </w:t>
       </w:r>
       <w:proofErr w:type="spellStart"/>
       <w:r>
-        <w:t>cwd</w:t>
-      </w:r>
-      <w:proofErr w:type="spellEnd"/>
+        <w:t>process_group</w:t>
+      </w:r>
+      <w:proofErr w:type="spellEnd"/>
+      <w:r>
+        <w:t>)</w:t>
+      </w:r>
+    </w:p>
+    <w:p>
+      <w:pPr>
+        <w:pStyle w:val="Listing"/>
+      </w:pPr>
+      <w:r>
+        <w:t xml:space="preserve">                        ^^^^^^^^^^^^^^^^^^^^^^^^^^^^^^^^^</w:t>
+      </w:r>
+    </w:p>
+    <w:p>
+      <w:pPr>
+        <w:pStyle w:val="Listing"/>
+      </w:pPr>
+      <w:r>
+        <w:t xml:space="preserve">  File "C:\Users\Nicolas\.conda\envs\fcrawler\Lib\subprocess.py", line 1552, in _</w:t>
+      </w:r>
+      <w:proofErr w:type="spellStart"/>
+      <w:r>
+        <w:t>execute_child</w:t>
+      </w:r>
+      <w:proofErr w:type="spellEnd"/>
+    </w:p>
+    <w:p>
+      <w:pPr>
+        <w:pStyle w:val="Listing"/>
+      </w:pPr>
+      <w:r>
+        <w:t xml:space="preserve">    </w:t>
+      </w:r>
+      <w:proofErr w:type="spellStart"/>
+      <w:proofErr w:type="gramStart"/>
+      <w:r>
+        <w:t>hp</w:t>
+      </w:r>
+      <w:proofErr w:type="spellEnd"/>
+      <w:proofErr w:type="gramEnd"/>
       <w:r>
         <w:t xml:space="preserve">, </w:t>
       </w:r>
       <w:proofErr w:type="spellStart"/>
       <w:r>
-        <w:t>env</w:t>
-      </w:r>
-      <w:proofErr w:type="spellEnd"/>
-      <w:r>
-        <w:t>,</w:t>
-      </w:r>
-    </w:p>
-    <w:p>
-      <w:pPr>
-        <w:pStyle w:val="Listing"/>
-      </w:pPr>
-      <w:r>
-        <w:t xml:space="preserve">                        ^^^^^^^^^^^^^^^^^^^</w:t>
-      </w:r>
-    </w:p>
-    <w:p>
-      <w:pPr>
-        <w:pStyle w:val="Listing"/>
-      </w:pPr>
-      <w:r>
-        <w:t xml:space="preserve">    ...&lt;5 </w:t>
-      </w:r>
-      <w:proofErr w:type="spellStart"/>
-      <w:r>
-        <w:t>lines</w:t>
-      </w:r>
-      <w:proofErr w:type="spellEnd"/>
-      <w:r>
-        <w:t>&gt;...</w:t>
-      </w:r>
-    </w:p>
-    <w:p>
-      <w:pPr>
-        <w:pStyle w:val="Listing"/>
-      </w:pPr>
-      <w:r>
-        <w:t xml:space="preserve">                        </w:t>
-      </w:r>
-      <w:proofErr w:type="spellStart"/>
-      <w:proofErr w:type="gramStart"/>
-      <w:r>
-        <w:t>gid</w:t>
-      </w:r>
-      <w:proofErr w:type="spellEnd"/>
-      <w:proofErr w:type="gramEnd"/>
+        <w:t>ht</w:t>
+      </w:r>
+      <w:proofErr w:type="spellEnd"/>
       <w:r>
         <w:t xml:space="preserve">, </w:t>
       </w:r>
       <w:proofErr w:type="spellStart"/>
       <w:r>
-        <w:t>gids</w:t>
+        <w:t>pid</w:t>
       </w:r>
       <w:proofErr w:type="spellEnd"/>
       <w:r>
@@ -790,106 +858,6 @@
       </w:r>
       <w:proofErr w:type="spellStart"/>
       <w:r>
-        <w:t>uid</w:t>
-      </w:r>
-      <w:proofErr w:type="spellEnd"/>
-      <w:r>
-        <w:t>, umask,</w:t>
-      </w:r>
-    </w:p>
-    <w:p>
-      <w:pPr>
-        <w:pStyle w:val="Listing"/>
-      </w:pPr>
-      <w:r>
-        <w:t xml:space="preserve">                        ^^^^^^^^^^^^^^^^^^^^^^</w:t>
-      </w:r>
-    </w:p>
-    <w:p>
-      <w:pPr>
-        <w:pStyle w:val="Listing"/>
-      </w:pPr>
-      <w:r>
-        <w:t xml:space="preserve">                        </w:t>
-      </w:r>
-      <w:proofErr w:type="spellStart"/>
-      <w:proofErr w:type="gramStart"/>
-      <w:r>
-        <w:t>start</w:t>
-      </w:r>
-      <w:proofErr w:type="gramEnd"/>
-      <w:r>
-        <w:t>_new_session</w:t>
-      </w:r>
-      <w:proofErr w:type="spellEnd"/>
-      <w:r>
-        <w:t xml:space="preserve">, </w:t>
-      </w:r>
-      <w:proofErr w:type="spellStart"/>
-      <w:r>
-        <w:t>process_group</w:t>
-      </w:r>
-      <w:proofErr w:type="spellEnd"/>
-      <w:r>
-        <w:t>)</w:t>
-      </w:r>
-    </w:p>
-    <w:p>
-      <w:pPr>
-        <w:pStyle w:val="Listing"/>
-      </w:pPr>
-      <w:r>
-        <w:t xml:space="preserve">                        ^^^^^^^^^^^^^^^^^^^^^^^^^^^^^^^^^</w:t>
-      </w:r>
-    </w:p>
-    <w:p>
-      <w:pPr>
-        <w:pStyle w:val="Listing"/>
-      </w:pPr>
-      <w:r>
-        <w:t xml:space="preserve">  File "C:\Users\Nicolas\.conda\envs\fcrawler\Lib\subprocess.py", line 1552, in _</w:t>
-      </w:r>
-      <w:proofErr w:type="spellStart"/>
-      <w:r>
-        <w:t>execute_child</w:t>
-      </w:r>
-      <w:proofErr w:type="spellEnd"/>
-    </w:p>
-    <w:p>
-      <w:pPr>
-        <w:pStyle w:val="Listing"/>
-      </w:pPr>
-      <w:r>
-        <w:t xml:space="preserve">    </w:t>
-      </w:r>
-      <w:proofErr w:type="spellStart"/>
-      <w:proofErr w:type="gramStart"/>
-      <w:r>
-        <w:t>hp</w:t>
-      </w:r>
-      <w:proofErr w:type="spellEnd"/>
-      <w:proofErr w:type="gramEnd"/>
-      <w:r>
-        <w:t xml:space="preserve">, </w:t>
-      </w:r>
-      <w:proofErr w:type="spellStart"/>
-      <w:r>
-        <w:t>ht</w:t>
-      </w:r>
-      <w:proofErr w:type="spellEnd"/>
-      <w:r>
-        <w:t xml:space="preserve">, </w:t>
-      </w:r>
-      <w:proofErr w:type="spellStart"/>
-      <w:r>
-        <w:t>pid</w:t>
-      </w:r>
-      <w:proofErr w:type="spellEnd"/>
-      <w:r>
-        <w:t xml:space="preserve">, </w:t>
-      </w:r>
-      <w:proofErr w:type="spellStart"/>
-      <w:r>
         <w:t>tid</w:t>
       </w:r>
       <w:proofErr w:type="spellEnd"/>
@@ -936,13 +904,8 @@
       </w:r>
       <w:proofErr w:type="spellEnd"/>
       <w:r>
-        <w:t xml:space="preserve"> </w:t>
-      </w:r>
-      <w:proofErr w:type="spellStart"/>
-      <w:r>
-        <w:t>security</w:t>
-      </w:r>
-      <w:proofErr w:type="spellEnd"/>
+        <w:t xml:space="preserve"> security</w:t>
+      </w:r>
     </w:p>
     <w:p>
       <w:pPr>
@@ -3356,6 +3319,9 @@
         <w:ind w:left="708"/>
       </w:pPr>
       <w:r>
+        <w:rPr>
+          <w:noProof/>
+        </w:rPr>
         <w:lastRenderedPageBreak/>
         <w:drawing>
           <wp:inline distT="0" distB="0" distL="0" distR="0" wp14:anchorId="0E595880" wp14:editId="3921FD87">
@@ -3421,10 +3387,7 @@
     </w:p>
     <w:p>
       <w:r>
-        <w:t xml:space="preserve">* pour chaque page lue correctement, tu l’enregistres dans le </w:t>
-      </w:r>
-      <w:r>
-        <w:t>sous-dossier « </w:t>
+        <w:t>* pour chaque page lue correctement, tu l’enregistres dans le sous-dossier « </w:t>
       </w:r>
       <w:proofErr w:type="spellStart"/>
       <w:r>
@@ -3432,10 +3395,7 @@
       </w:r>
       <w:proofErr w:type="spellEnd"/>
       <w:r>
-        <w:t>/pages »</w:t>
-      </w:r>
-      <w:r>
-        <w:t xml:space="preserve">, avec pour nom l’url, dans laquelle tu supprimes « https:// » et tu remplaces le caractère « / » par </w:t>
+        <w:t xml:space="preserve">/pages », avec pour nom l’url, dans laquelle tu supprimes « https:// » et tu remplaces le caractère « / » par </w:t>
       </w:r>
       <w:proofErr w:type="gramStart"/>
       <w:r>
@@ -3555,13 +3515,7 @@
       </w:r>
       <w:proofErr w:type="spellEnd"/>
       <w:r>
-        <w:t>-forge</w:t>
-      </w:r>
-      <w:r>
-        <w:t xml:space="preserve"> </w:t>
-      </w:r>
-      <w:r>
-        <w:t>beautifulsoup4</w:t>
+        <w:t>-forge beautifulsoup4</w:t>
       </w:r>
     </w:p>
     <w:p/>
@@ -4391,10 +4345,12 @@
         <w:pStyle w:val="Listing"/>
       </w:pPr>
       <w:proofErr w:type="spellStart"/>
+      <w:proofErr w:type="gramStart"/>
       <w:r>
         <w:t>def</w:t>
       </w:r>
       <w:proofErr w:type="spellEnd"/>
+      <w:proofErr w:type="gramEnd"/>
       <w:r>
         <w:t xml:space="preserve"> </w:t>
       </w:r>
@@ -4412,12 +4368,25 @@
         <w:t>sanitize</w:t>
       </w:r>
       <w:r>
-        <w:t>_filename</w:t>
-      </w:r>
-      <w:proofErr w:type="spellEnd"/>
-      <w:r>
-        <w:t>(self, url):</w:t>
-      </w:r>
+        <w:t>_</w:t>
+      </w:r>
+      <w:proofErr w:type="gramStart"/>
+      <w:r>
+        <w:t>filename</w:t>
+      </w:r>
+      <w:proofErr w:type="spellEnd"/>
+      <w:r>
+        <w:t>(</w:t>
+      </w:r>
+      <w:proofErr w:type="gramEnd"/>
+      <w:r>
+        <w:t>self, url</w:t>
+      </w:r>
+      <w:proofErr w:type="gramStart"/>
+      <w:r>
+        <w:t>):</w:t>
+      </w:r>
+      <w:proofErr w:type="gramEnd"/>
       <w:r>
         <w:br/>
         <w:t xml:space="preserve">    </w:t>
@@ -4886,13 +4855,7 @@
       </w:r>
       <w:proofErr w:type="spellEnd"/>
       <w:r>
-        <w:t> : ajoute un critère</w:t>
-      </w:r>
-      <w:r>
-        <w:t xml:space="preserve"> supplémentaire</w:t>
-      </w:r>
-      <w:r>
-        <w:t xml:space="preserve"> à l’url à ajouter en file : elle doit contenir le texte </w:t>
+        <w:t xml:space="preserve"> : ajoute un critère supplémentaire à l’url à ajouter en file : elle doit contenir le texte </w:t>
       </w:r>
       <w:r>
         <w:t>"</w:t>
@@ -4904,10 +4867,7 @@
         <w:t xml:space="preserve">" </w:t>
       </w:r>
       <w:r>
-        <w:t xml:space="preserve">en plus du </w:t>
-      </w:r>
-      <w:r>
-        <w:t xml:space="preserve">texte </w:t>
+        <w:t xml:space="preserve">en plus du texte </w:t>
       </w:r>
       <w:r>
         <w:t>"</w:t>
@@ -5160,13 +5120,7 @@
       </w:r>
       <w:proofErr w:type="spellEnd"/>
       <w:r>
-        <w:t xml:space="preserve"> : </w:t>
-      </w:r>
-      <w:r>
-        <w:t>incrémenté de 1 à chaque fois est</w:t>
-      </w:r>
-      <w:r>
-        <w:t xml:space="preserve"> lue à partir du cache</w:t>
+        <w:t> : incrémenté de 1 à chaque fois est lue à partir du cache</w:t>
       </w:r>
     </w:p>
     <w:p>
@@ -5255,10 +5209,7 @@
       </w:r>
       <w:proofErr w:type="spellEnd"/>
       <w:r>
-        <w:t> :</w:t>
-      </w:r>
-      <w:r>
-        <w:t xml:space="preserve"> supprime l’affichage de la métadonnée « profondeur »</w:t>
+        <w:t> : supprime l’affichage de la métadonnée « profondeur »</w:t>
       </w:r>
     </w:p>
     <w:p/>
@@ -6513,10 +6464,7 @@
       </w:r>
       <w:proofErr w:type="spellEnd"/>
       <w:r>
-        <w:t xml:space="preserve"> : </w:t>
-      </w:r>
-      <w:r>
-        <w:t>s</w:t>
+        <w:t> : s</w:t>
       </w:r>
       <w:r>
         <w:t xml:space="preserve">i la page </w:t>
@@ -6525,10 +6473,7 @@
         <w:t xml:space="preserve">chargée </w:t>
       </w:r>
       <w:r>
-        <w:t xml:space="preserve">contient un bouton avec comme identifiant </w:t>
-      </w:r>
-      <w:r>
-        <w:t>id="</w:t>
+        <w:t>contient un bouton avec comme identifiant id="</w:t>
       </w:r>
       <w:r>
         <w:rPr>
@@ -6537,10 +6482,7 @@
         <w:t>tarteaucitronPersonalize2</w:t>
       </w:r>
       <w:r>
-        <w:t>"</w:t>
-      </w:r>
-      <w:r>
-        <w:t>, alors :</w:t>
+        <w:t>", alors :</w:t>
       </w:r>
     </w:p>
     <w:p>
@@ -6706,13 +6648,7 @@
       </w:r>
       <w:proofErr w:type="gramEnd"/>
       <w:r>
-        <w:t xml:space="preserve"> une trace « </w:t>
-      </w:r>
-      <w:r>
-        <w:t>Simulation déplacement souris</w:t>
-      </w:r>
-      <w:r>
-        <w:t>… »</w:t>
+        <w:t xml:space="preserve"> une trace « Simulation déplacement souris… »</w:t>
       </w:r>
     </w:p>
     <w:p>
@@ -6763,13 +6699,7 @@
       </w:r>
       <w:proofErr w:type="gramEnd"/>
       <w:r>
-        <w:t xml:space="preserve"> une trace « </w:t>
-      </w:r>
-      <w:r>
-        <w:t>Rechargement page</w:t>
-      </w:r>
-      <w:r>
-        <w:t>… »</w:t>
+        <w:t xml:space="preserve"> une trace « Rechargement page… »</w:t>
       </w:r>
     </w:p>
     <w:p>
@@ -7588,42 +7518,39 @@
     <w:p/>
     <w:p>
       <w:r>
-        <w:t>Déplace le test</w:t>
-      </w:r>
+        <w:t xml:space="preserve">Déplace le test </w:t>
+      </w:r>
+      <w:r>
+        <w:t>"</w:t>
+      </w:r>
+      <w:proofErr w:type="spellStart"/>
+      <w:proofErr w:type="gramStart"/>
+      <w:r>
+        <w:t>challenges.cloudflare</w:t>
+      </w:r>
+      <w:proofErr w:type="spellEnd"/>
+      <w:proofErr w:type="gramEnd"/>
+      <w:r>
+        <w:t>"</w:t>
+      </w:r>
+      <w:r>
+        <w:t xml:space="preserve"> après le bloc </w:t>
+      </w:r>
+      <w:proofErr w:type="spellStart"/>
+      <w:r>
+        <w:t>WebDriverWait</w:t>
+      </w:r>
+      <w:proofErr w:type="spellEnd"/>
+    </w:p>
+    <w:p>
+      <w:proofErr w:type="gramStart"/>
+      <w:r>
+        <w:t>et</w:t>
+      </w:r>
+      <w:proofErr w:type="gramEnd"/>
       <w:r>
         <w:t xml:space="preserve"> </w:t>
       </w:r>
-      <w:r>
-        <w:t>"</w:t>
-      </w:r>
-      <w:proofErr w:type="spellStart"/>
-      <w:proofErr w:type="gramStart"/>
-      <w:r>
-        <w:t>challenges.cloudflare</w:t>
-      </w:r>
-      <w:proofErr w:type="spellEnd"/>
-      <w:proofErr w:type="gramEnd"/>
-      <w:r>
-        <w:t>"</w:t>
-      </w:r>
-      <w:r>
-        <w:t xml:space="preserve"> après le bloc </w:t>
-      </w:r>
-      <w:proofErr w:type="spellStart"/>
-      <w:r>
-        <w:t>WebDriverWait</w:t>
-      </w:r>
-      <w:proofErr w:type="spellEnd"/>
-    </w:p>
-    <w:p>
-      <w:proofErr w:type="gramStart"/>
-      <w:r>
-        <w:t>et</w:t>
-      </w:r>
-      <w:proofErr w:type="gramEnd"/>
-      <w:r>
-        <w:t xml:space="preserve"> </w:t>
-      </w:r>
       <w:proofErr w:type="gramStart"/>
       <w:r>
         <w:t>redonne moi</w:t>
@@ -7689,13 +7616,7 @@
     <w:p/>
     <w:p>
       <w:r>
-        <w:t xml:space="preserve">Il ne faut comptabiliser les erreurs </w:t>
-      </w:r>
-      <w:r>
-        <w:t>sur le challenge</w:t>
-      </w:r>
-      <w:r>
-        <w:t xml:space="preserve"> (</w:t>
+        <w:t>Il ne faut comptabiliser les erreurs sur le challenge (</w:t>
       </w:r>
       <w:proofErr w:type="spellStart"/>
       <w:r>
@@ -9644,6 +9565,2276 @@
       <w:pPr>
         <w:pStyle w:val="Listing"/>
       </w:pPr>
+    </w:p>
+    <w:p/>
+    <w:p/>
+    <w:p>
+      <w:r>
+        <w:t>Plantages aléatoires qui ne rendent pas la main :</w:t>
+      </w:r>
+    </w:p>
+    <w:p>
+      <w:pPr>
+        <w:pStyle w:val="Listing"/>
+      </w:pPr>
+    </w:p>
+    <w:p>
+      <w:pPr>
+        <w:pStyle w:val="Listing"/>
+      </w:pPr>
+      <w:r>
+        <w:t xml:space="preserve">2026-03-29 </w:t>
+      </w:r>
+      <w:proofErr w:type="gramStart"/>
+      <w:r>
+        <w:t>20:15:</w:t>
+      </w:r>
+      <w:proofErr w:type="gramEnd"/>
+      <w:r>
+        <w:t xml:space="preserve">24 </w:t>
+      </w:r>
+      <w:proofErr w:type="spellStart"/>
+      <w:proofErr w:type="gramStart"/>
+      <w:r>
+        <w:t>GeneanetSpider</w:t>
+      </w:r>
+      <w:proofErr w:type="spellEnd"/>
+      <w:r>
+        <w:t>[ 117</w:t>
+      </w:r>
+      <w:proofErr w:type="gramEnd"/>
+      <w:r>
+        <w:t xml:space="preserve">] </w:t>
+      </w:r>
+      <w:proofErr w:type="gramStart"/>
+      <w:r>
+        <w:t>INFO:</w:t>
+      </w:r>
+      <w:proofErr w:type="gramEnd"/>
+      <w:r>
+        <w:t xml:space="preserve"> </w:t>
+      </w:r>
+      <w:proofErr w:type="spellStart"/>
+      <w:r>
+        <w:t>Starting</w:t>
+      </w:r>
+      <w:proofErr w:type="spellEnd"/>
+      <w:r>
+        <w:t xml:space="preserve"> </w:t>
+      </w:r>
+      <w:proofErr w:type="spellStart"/>
+      <w:r>
+        <w:t>GeneanetFSpider</w:t>
+      </w:r>
+      <w:proofErr w:type="spellEnd"/>
+      <w:r>
+        <w:t xml:space="preserve"> 2.0.6</w:t>
+      </w:r>
+    </w:p>
+    <w:p>
+      <w:pPr>
+        <w:pStyle w:val="Listing"/>
+      </w:pPr>
+      <w:proofErr w:type="spellStart"/>
+      <w:r>
+        <w:t>Traceback</w:t>
+      </w:r>
+      <w:proofErr w:type="spellEnd"/>
+      <w:r>
+        <w:t xml:space="preserve"> (</w:t>
+      </w:r>
+      <w:proofErr w:type="spellStart"/>
+      <w:r>
+        <w:t>most</w:t>
+      </w:r>
+      <w:proofErr w:type="spellEnd"/>
+      <w:r>
+        <w:t xml:space="preserve"> </w:t>
+      </w:r>
+      <w:proofErr w:type="spellStart"/>
+      <w:r>
+        <w:t>recent</w:t>
+      </w:r>
+      <w:proofErr w:type="spellEnd"/>
+      <w:r>
+        <w:t xml:space="preserve"> call last</w:t>
+      </w:r>
+      <w:proofErr w:type="gramStart"/>
+      <w:r>
+        <w:t>):</w:t>
+      </w:r>
+      <w:proofErr w:type="gramEnd"/>
+    </w:p>
+    <w:p>
+      <w:pPr>
+        <w:pStyle w:val="Listing"/>
+      </w:pPr>
+      <w:r>
+        <w:t xml:space="preserve">  File "D:\Users\Nicolas\Documents\Python\geneanet_v2\geneanet\spiders\geneanet_spider.py", line 1215, in &lt;module&gt;</w:t>
+      </w:r>
+    </w:p>
+    <w:p>
+      <w:pPr>
+        <w:pStyle w:val="Listing"/>
+      </w:pPr>
+      <w:r>
+        <w:t xml:space="preserve">    </w:t>
+      </w:r>
+      <w:proofErr w:type="gramStart"/>
+      <w:r>
+        <w:t>crawler</w:t>
+      </w:r>
+      <w:proofErr w:type="gramEnd"/>
+      <w:r>
+        <w:t xml:space="preserve"> = </w:t>
+      </w:r>
+      <w:proofErr w:type="spellStart"/>
+      <w:proofErr w:type="gramStart"/>
+      <w:r>
+        <w:t>GeneanetSpider</w:t>
+      </w:r>
+      <w:proofErr w:type="spellEnd"/>
+      <w:r>
+        <w:t xml:space="preserve">( </w:t>
+      </w:r>
+      <w:proofErr w:type="spellStart"/>
+      <w:r>
+        <w:t>max</w:t>
+      </w:r>
+      <w:proofErr w:type="gramEnd"/>
+      <w:r>
+        <w:t>_pages</w:t>
+      </w:r>
+      <w:proofErr w:type="spellEnd"/>
+      <w:r>
+        <w:t>=</w:t>
+      </w:r>
+      <w:proofErr w:type="spellStart"/>
+      <w:r>
+        <w:t>args.max_pages</w:t>
+      </w:r>
+      <w:proofErr w:type="spellEnd"/>
+      <w:r>
+        <w:t xml:space="preserve">, </w:t>
+      </w:r>
+      <w:proofErr w:type="spellStart"/>
+      <w:r>
+        <w:t>max_cloudflare_errors</w:t>
+      </w:r>
+      <w:proofErr w:type="spellEnd"/>
+      <w:r>
+        <w:t>=</w:t>
+      </w:r>
+      <w:proofErr w:type="spellStart"/>
+      <w:r>
+        <w:t>args.max_cloudflare_errors</w:t>
+      </w:r>
+      <w:proofErr w:type="spellEnd"/>
+      <w:r>
+        <w:t xml:space="preserve">, </w:t>
+      </w:r>
+      <w:proofErr w:type="spellStart"/>
+      <w:r>
+        <w:t>min_delay</w:t>
+      </w:r>
+      <w:proofErr w:type="spellEnd"/>
+      <w:r>
+        <w:t>=</w:t>
+      </w:r>
+      <w:proofErr w:type="spellStart"/>
+      <w:r>
+        <w:t>args.min_delay</w:t>
+      </w:r>
+      <w:proofErr w:type="spellEnd"/>
+      <w:r>
+        <w:t xml:space="preserve">, </w:t>
+      </w:r>
+      <w:proofErr w:type="spellStart"/>
+      <w:r>
+        <w:t>max_delay</w:t>
+      </w:r>
+      <w:proofErr w:type="spellEnd"/>
+      <w:r>
+        <w:t>=</w:t>
+      </w:r>
+      <w:proofErr w:type="spellStart"/>
+      <w:r>
+        <w:t>args.max_delay</w:t>
+      </w:r>
+      <w:proofErr w:type="spellEnd"/>
+      <w:r>
+        <w:t xml:space="preserve">, </w:t>
+      </w:r>
+      <w:proofErr w:type="spellStart"/>
+      <w:r>
+        <w:t>headless</w:t>
+      </w:r>
+      <w:proofErr w:type="spellEnd"/>
+      <w:r>
+        <w:t>=</w:t>
+      </w:r>
+      <w:proofErr w:type="spellStart"/>
+      <w:proofErr w:type="gramStart"/>
+      <w:r>
+        <w:t>args.headless</w:t>
+      </w:r>
+      <w:proofErr w:type="spellEnd"/>
+      <w:proofErr w:type="gramEnd"/>
+      <w:r>
+        <w:t xml:space="preserve"> )</w:t>
+      </w:r>
+    </w:p>
+    <w:p>
+      <w:pPr>
+        <w:pStyle w:val="Listing"/>
+      </w:pPr>
+      <w:r>
+        <w:t xml:space="preserve">              ^^^^^^^^^^^^^^^^^^^^^^^^^^^^^^^^^^^^^^^^^^^^^^^^^^^^^^^^^^^^^^^^^^^^^^^^^^^^^^^^^^^^^^^^^^^^^^^^^^^^^^^^^^^^^^^^^^^^^^^^^^^^^^^^^^^^^^^^^^^^^^^^^^^^^^^^^^^^^^^^^^^^^^^^</w:t>
+      </w:r>
+    </w:p>
+    <w:p>
+      <w:pPr>
+        <w:pStyle w:val="Listing"/>
+      </w:pPr>
+      <w:r>
+        <w:t xml:space="preserve">  File "D:\Users\Nicolas\Documents\Python\geneanet_v2\geneanet\spiders\geneanet_spider.py", line 119, in __init__</w:t>
+      </w:r>
+    </w:p>
+    <w:p>
+      <w:pPr>
+        <w:pStyle w:val="Listing"/>
+      </w:pPr>
+      <w:r>
+        <w:t xml:space="preserve">    </w:t>
+      </w:r>
+      <w:proofErr w:type="gramStart"/>
+      <w:r>
+        <w:t>super()._</w:t>
+      </w:r>
+      <w:proofErr w:type="gramEnd"/>
+      <w:r>
+        <w:t>_init_</w:t>
+      </w:r>
+      <w:proofErr w:type="gramStart"/>
+      <w:r>
+        <w:t>_(</w:t>
+      </w:r>
+      <w:proofErr w:type="spellStart"/>
+      <w:proofErr w:type="gramEnd"/>
+      <w:r>
+        <w:t>max_pages</w:t>
+      </w:r>
+      <w:proofErr w:type="spellEnd"/>
+      <w:r>
+        <w:t>=</w:t>
+      </w:r>
+      <w:proofErr w:type="spellStart"/>
+      <w:r>
+        <w:t>max_pages</w:t>
+      </w:r>
+      <w:proofErr w:type="spellEnd"/>
+      <w:r>
+        <w:t xml:space="preserve">, </w:t>
+      </w:r>
+      <w:proofErr w:type="spellStart"/>
+      <w:r>
+        <w:t>max_cloudflare_errors</w:t>
+      </w:r>
+      <w:proofErr w:type="spellEnd"/>
+      <w:r>
+        <w:t>=</w:t>
+      </w:r>
+      <w:proofErr w:type="spellStart"/>
+      <w:r>
+        <w:t>max_cloudflare_errors</w:t>
+      </w:r>
+      <w:proofErr w:type="spellEnd"/>
+      <w:r>
+        <w:t xml:space="preserve">, </w:t>
+      </w:r>
+      <w:proofErr w:type="spellStart"/>
+      <w:r>
+        <w:t>min_delay</w:t>
+      </w:r>
+      <w:proofErr w:type="spellEnd"/>
+      <w:r>
+        <w:t>=</w:t>
+      </w:r>
+      <w:proofErr w:type="spellStart"/>
+      <w:r>
+        <w:t>min_delay</w:t>
+      </w:r>
+      <w:proofErr w:type="spellEnd"/>
+      <w:r>
+        <w:t xml:space="preserve">, </w:t>
+      </w:r>
+      <w:proofErr w:type="spellStart"/>
+      <w:r>
+        <w:t>max_delay</w:t>
+      </w:r>
+      <w:proofErr w:type="spellEnd"/>
+      <w:r>
+        <w:t>=</w:t>
+      </w:r>
+      <w:proofErr w:type="spellStart"/>
+      <w:r>
+        <w:t>max_delay</w:t>
+      </w:r>
+      <w:proofErr w:type="spellEnd"/>
+      <w:r>
+        <w:t xml:space="preserve">, </w:t>
+      </w:r>
+      <w:proofErr w:type="spellStart"/>
+      <w:r>
+        <w:t>headless</w:t>
+      </w:r>
+      <w:proofErr w:type="spellEnd"/>
+      <w:r>
+        <w:t>=</w:t>
+      </w:r>
+      <w:proofErr w:type="spellStart"/>
+      <w:r>
+        <w:t>headless</w:t>
+      </w:r>
+      <w:proofErr w:type="spellEnd"/>
+      <w:r>
+        <w:t>)</w:t>
+      </w:r>
+    </w:p>
+    <w:p>
+      <w:pPr>
+        <w:pStyle w:val="Listing"/>
+      </w:pPr>
+      <w:r>
+        <w:t xml:space="preserve">  File "D:\Users\Nicolas\Documents\Python\geneanet_v2\geneanet\crawler.py", line 98, in __init__</w:t>
+      </w:r>
+    </w:p>
+    <w:p>
+      <w:pPr>
+        <w:pStyle w:val="Listing"/>
+      </w:pPr>
+      <w:r>
+        <w:t xml:space="preserve">    </w:t>
+      </w:r>
+      <w:proofErr w:type="gramStart"/>
+      <w:r>
+        <w:t>self._</w:t>
+      </w:r>
+      <w:proofErr w:type="spellStart"/>
+      <w:proofErr w:type="gramEnd"/>
+      <w:r>
+        <w:t>init_</w:t>
+      </w:r>
+      <w:proofErr w:type="gramStart"/>
+      <w:r>
+        <w:t>driver</w:t>
+      </w:r>
+      <w:proofErr w:type="spellEnd"/>
+      <w:r>
+        <w:t>(</w:t>
+      </w:r>
+      <w:proofErr w:type="gramEnd"/>
+      <w:r>
+        <w:t>)</w:t>
+      </w:r>
+    </w:p>
+    <w:p>
+      <w:pPr>
+        <w:pStyle w:val="Listing"/>
+      </w:pPr>
+      <w:r>
+        <w:t xml:space="preserve">  File "D:\Users\Nicolas\Documents\Python\geneanet_v2\geneanet\crawler.py", line 134, in _</w:t>
+      </w:r>
+      <w:proofErr w:type="spellStart"/>
+      <w:r>
+        <w:t>init_driver</w:t>
+      </w:r>
+      <w:proofErr w:type="spellEnd"/>
+    </w:p>
+    <w:p>
+      <w:pPr>
+        <w:pStyle w:val="Listing"/>
+      </w:pPr>
+      <w:r>
+        <w:t xml:space="preserve">    </w:t>
+      </w:r>
+      <w:proofErr w:type="spellStart"/>
+      <w:r>
+        <w:t>self.driver.set_window_</w:t>
+      </w:r>
+      <w:proofErr w:type="gramStart"/>
+      <w:r>
+        <w:t>size</w:t>
+      </w:r>
+      <w:proofErr w:type="spellEnd"/>
+      <w:r>
+        <w:t>(</w:t>
+      </w:r>
+      <w:proofErr w:type="gramEnd"/>
+      <w:r>
+        <w:t>1280, 800)</w:t>
+      </w:r>
+    </w:p>
+    <w:p>
+      <w:pPr>
+        <w:pStyle w:val="Listing"/>
+      </w:pPr>
+      <w:r>
+        <w:t xml:space="preserve">  File "C:\Users\Nicolas\.conda\envs\scrapy\Lib\site-packages\selenium\webdriver\remote\webdriver.py", line 928, in </w:t>
+      </w:r>
+      <w:proofErr w:type="spellStart"/>
+      <w:r>
+        <w:t>set_window_size</w:t>
+      </w:r>
+      <w:proofErr w:type="spellEnd"/>
+    </w:p>
+    <w:p>
+      <w:pPr>
+        <w:pStyle w:val="Listing"/>
+      </w:pPr>
+      <w:r>
+        <w:t xml:space="preserve">    </w:t>
+      </w:r>
+      <w:proofErr w:type="spellStart"/>
+      <w:r>
+        <w:t>self.set_window_rect</w:t>
+      </w:r>
+      <w:proofErr w:type="spellEnd"/>
+      <w:r>
+        <w:t>(</w:t>
+      </w:r>
+      <w:proofErr w:type="spellStart"/>
+      <w:r>
+        <w:t>width</w:t>
+      </w:r>
+      <w:proofErr w:type="spellEnd"/>
+      <w:r>
+        <w:t>=</w:t>
+      </w:r>
+      <w:proofErr w:type="spellStart"/>
+      <w:r>
+        <w:t>int</w:t>
+      </w:r>
+      <w:proofErr w:type="spellEnd"/>
+      <w:r>
+        <w:t>(</w:t>
+      </w:r>
+      <w:proofErr w:type="spellStart"/>
+      <w:r>
+        <w:t>width</w:t>
+      </w:r>
+      <w:proofErr w:type="spellEnd"/>
+      <w:r>
+        <w:t xml:space="preserve">), </w:t>
+      </w:r>
+      <w:proofErr w:type="spellStart"/>
+      <w:r>
+        <w:t>height</w:t>
+      </w:r>
+      <w:proofErr w:type="spellEnd"/>
+      <w:r>
+        <w:t>=</w:t>
+      </w:r>
+      <w:proofErr w:type="spellStart"/>
+      <w:r>
+        <w:t>int</w:t>
+      </w:r>
+      <w:proofErr w:type="spellEnd"/>
+      <w:r>
+        <w:t>(</w:t>
+      </w:r>
+      <w:proofErr w:type="spellStart"/>
+      <w:r>
+        <w:t>height</w:t>
+      </w:r>
+      <w:proofErr w:type="spellEnd"/>
+      <w:r>
+        <w:t>))</w:t>
+      </w:r>
+    </w:p>
+    <w:p>
+      <w:pPr>
+        <w:pStyle w:val="Listing"/>
+      </w:pPr>
+      <w:r>
+        <w:t xml:space="preserve">  File "C:\Users\Nicolas\.conda\envs\scrapy\Lib\site-packages\selenium\webdriver\remote\webdriver.py", line 1000, in </w:t>
+      </w:r>
+      <w:proofErr w:type="spellStart"/>
+      <w:r>
+        <w:t>set_window_rect</w:t>
+      </w:r>
+      <w:proofErr w:type="spellEnd"/>
+    </w:p>
+    <w:p>
+      <w:pPr>
+        <w:pStyle w:val="Listing"/>
+      </w:pPr>
+      <w:r>
+        <w:t xml:space="preserve">    </w:t>
+      </w:r>
+      <w:proofErr w:type="gramStart"/>
+      <w:r>
+        <w:t>return</w:t>
+      </w:r>
+      <w:proofErr w:type="gramEnd"/>
+      <w:r>
+        <w:t xml:space="preserve"> </w:t>
+      </w:r>
+      <w:proofErr w:type="spellStart"/>
+      <w:proofErr w:type="gramStart"/>
+      <w:r>
+        <w:t>self.execute</w:t>
+      </w:r>
+      <w:proofErr w:type="spellEnd"/>
+      <w:proofErr w:type="gramEnd"/>
+      <w:r>
+        <w:t>(</w:t>
+      </w:r>
+      <w:proofErr w:type="spellStart"/>
+      <w:r>
+        <w:t>Command.SET_WINDOW_RECT</w:t>
+      </w:r>
+      <w:proofErr w:type="spellEnd"/>
+      <w:r>
+        <w:t>, {"x</w:t>
+      </w:r>
+      <w:proofErr w:type="gramStart"/>
+      <w:r>
+        <w:t>":</w:t>
+      </w:r>
+      <w:proofErr w:type="gramEnd"/>
+      <w:r>
+        <w:t xml:space="preserve"> x, "y</w:t>
+      </w:r>
+      <w:proofErr w:type="gramStart"/>
+      <w:r>
+        <w:t>":</w:t>
+      </w:r>
+      <w:proofErr w:type="gramEnd"/>
+      <w:r>
+        <w:t xml:space="preserve"> y, "</w:t>
+      </w:r>
+      <w:proofErr w:type="spellStart"/>
+      <w:r>
+        <w:t>width</w:t>
+      </w:r>
+      <w:proofErr w:type="spellEnd"/>
+      <w:proofErr w:type="gramStart"/>
+      <w:r>
+        <w:t>":</w:t>
+      </w:r>
+      <w:proofErr w:type="gramEnd"/>
+      <w:r>
+        <w:t xml:space="preserve"> </w:t>
+      </w:r>
+      <w:proofErr w:type="spellStart"/>
+      <w:r>
+        <w:t>width</w:t>
+      </w:r>
+      <w:proofErr w:type="spellEnd"/>
+      <w:r>
+        <w:t>, "</w:t>
+      </w:r>
+      <w:proofErr w:type="spellStart"/>
+      <w:r>
+        <w:t>height</w:t>
+      </w:r>
+      <w:proofErr w:type="spellEnd"/>
+      <w:proofErr w:type="gramStart"/>
+      <w:r>
+        <w:t>":</w:t>
+      </w:r>
+      <w:proofErr w:type="gramEnd"/>
+      <w:r>
+        <w:t xml:space="preserve"> </w:t>
+      </w:r>
+      <w:proofErr w:type="spellStart"/>
+      <w:r>
+        <w:t>height</w:t>
+      </w:r>
+      <w:proofErr w:type="spellEnd"/>
+      <w:proofErr w:type="gramStart"/>
+      <w:r>
+        <w:t>})[</w:t>
+      </w:r>
+      <w:proofErr w:type="gramEnd"/>
+      <w:r>
+        <w:t>"value"]</w:t>
+      </w:r>
+    </w:p>
+    <w:p>
+      <w:pPr>
+        <w:pStyle w:val="Listing"/>
+      </w:pPr>
+      <w:r>
+        <w:lastRenderedPageBreak/>
+        <w:t xml:space="preserve">           ^^^^^^^^^^^^^^^^^^^^^^^^^^^^^^^^^^^^^^^^^^^^^^^^^^^^^^^^^^^^^^^^^^^^^^^^^^^^^^^^^^^^^^^^^</w:t>
+      </w:r>
+    </w:p>
+    <w:p>
+      <w:pPr>
+        <w:pStyle w:val="Listing"/>
+      </w:pPr>
+      <w:r>
+        <w:t xml:space="preserve">  File "C:\Users\Nicolas\.conda\envs\scrapy\Lib\site-packages\selenium\webdriver\remote\webdriver.py", line 446, in </w:t>
+      </w:r>
+      <w:proofErr w:type="spellStart"/>
+      <w:r>
+        <w:t>execute</w:t>
+      </w:r>
+      <w:proofErr w:type="spellEnd"/>
+    </w:p>
+    <w:p>
+      <w:pPr>
+        <w:pStyle w:val="Listing"/>
+      </w:pPr>
+      <w:r>
+        <w:t xml:space="preserve">    </w:t>
+      </w:r>
+      <w:proofErr w:type="spellStart"/>
+      <w:proofErr w:type="gramStart"/>
+      <w:r>
+        <w:t>self.error</w:t>
+      </w:r>
+      <w:proofErr w:type="gramEnd"/>
+      <w:r>
+        <w:t>_</w:t>
+      </w:r>
+      <w:proofErr w:type="gramStart"/>
+      <w:r>
+        <w:t>handler.check</w:t>
+      </w:r>
+      <w:proofErr w:type="gramEnd"/>
+      <w:r>
+        <w:t>_response</w:t>
+      </w:r>
+      <w:proofErr w:type="spellEnd"/>
+      <w:r>
+        <w:t>(</w:t>
+      </w:r>
+      <w:proofErr w:type="spellStart"/>
+      <w:r>
+        <w:t>response</w:t>
+      </w:r>
+      <w:proofErr w:type="spellEnd"/>
+      <w:r>
+        <w:t>)</w:t>
+      </w:r>
+    </w:p>
+    <w:p>
+      <w:pPr>
+        <w:pStyle w:val="Listing"/>
+      </w:pPr>
+      <w:r>
+        <w:t xml:space="preserve">  File "C:\Users\Nicolas\.conda\envs\scrapy\Lib\site-packages\selenium\webdriver\remote\errorhandler.py", line 232, in </w:t>
+      </w:r>
+      <w:proofErr w:type="spellStart"/>
+      <w:r>
+        <w:t>check_response</w:t>
+      </w:r>
+      <w:proofErr w:type="spellEnd"/>
+    </w:p>
+    <w:p>
+      <w:pPr>
+        <w:pStyle w:val="Listing"/>
+      </w:pPr>
+      <w:r>
+        <w:t xml:space="preserve">    </w:t>
+      </w:r>
+      <w:proofErr w:type="spellStart"/>
+      <w:proofErr w:type="gramStart"/>
+      <w:r>
+        <w:t>raise</w:t>
+      </w:r>
+      <w:proofErr w:type="spellEnd"/>
+      <w:proofErr w:type="gramEnd"/>
+      <w:r>
+        <w:t xml:space="preserve"> </w:t>
+      </w:r>
+      <w:proofErr w:type="spellStart"/>
+      <w:r>
+        <w:t>exception_</w:t>
+      </w:r>
+      <w:proofErr w:type="gramStart"/>
+      <w:r>
+        <w:t>class</w:t>
+      </w:r>
+      <w:proofErr w:type="spellEnd"/>
+      <w:r>
+        <w:t>(</w:t>
+      </w:r>
+      <w:proofErr w:type="gramEnd"/>
+      <w:r>
+        <w:t xml:space="preserve">message, screen, </w:t>
+      </w:r>
+      <w:proofErr w:type="spellStart"/>
+      <w:r>
+        <w:t>stacktrace</w:t>
+      </w:r>
+      <w:proofErr w:type="spellEnd"/>
+      <w:r>
+        <w:t>)</w:t>
+      </w:r>
+    </w:p>
+    <w:p>
+      <w:pPr>
+        <w:pStyle w:val="Listing"/>
+      </w:pPr>
+      <w:proofErr w:type="spellStart"/>
+      <w:proofErr w:type="gramStart"/>
+      <w:r>
+        <w:t>selenium.common</w:t>
+      </w:r>
+      <w:proofErr w:type="gramEnd"/>
+      <w:r>
+        <w:t>.</w:t>
+      </w:r>
+      <w:proofErr w:type="gramStart"/>
+      <w:r>
+        <w:t>exceptions.NoSuchWindowException</w:t>
+      </w:r>
+      <w:proofErr w:type="spellEnd"/>
+      <w:proofErr w:type="gramEnd"/>
+      <w:r>
+        <w:t xml:space="preserve">: </w:t>
+      </w:r>
+      <w:proofErr w:type="gramStart"/>
+      <w:r>
+        <w:t>Message:</w:t>
+      </w:r>
+      <w:proofErr w:type="gramEnd"/>
+      <w:r>
+        <w:t xml:space="preserve"> </w:t>
+      </w:r>
+      <w:proofErr w:type="spellStart"/>
+      <w:r>
+        <w:t>Browsing</w:t>
+      </w:r>
+      <w:proofErr w:type="spellEnd"/>
+      <w:r>
+        <w:t xml:space="preserve"> </w:t>
+      </w:r>
+      <w:proofErr w:type="spellStart"/>
+      <w:r>
+        <w:t>context</w:t>
+      </w:r>
+      <w:proofErr w:type="spellEnd"/>
+      <w:r>
+        <w:t xml:space="preserve"> has been </w:t>
+      </w:r>
+      <w:proofErr w:type="spellStart"/>
+      <w:r>
+        <w:t>discarded</w:t>
+      </w:r>
+      <w:proofErr w:type="spellEnd"/>
+    </w:p>
+    <w:p>
+      <w:pPr>
+        <w:pStyle w:val="Listing"/>
+      </w:pPr>
+      <w:proofErr w:type="spellStart"/>
+      <w:proofErr w:type="gramStart"/>
+      <w:r>
+        <w:t>Stacktrace</w:t>
+      </w:r>
+      <w:proofErr w:type="spellEnd"/>
+      <w:r>
+        <w:t>:</w:t>
+      </w:r>
+      <w:proofErr w:type="gramEnd"/>
+    </w:p>
+    <w:p>
+      <w:pPr>
+        <w:pStyle w:val="Listing"/>
+      </w:pPr>
+      <w:r>
+        <w:t>RemoteError@chrome://remote/content/shared/RemoteError.sys.mjs:8:8</w:t>
+      </w:r>
+    </w:p>
+    <w:p>
+      <w:pPr>
+        <w:pStyle w:val="Listing"/>
+      </w:pPr>
+      <w:r>
+        <w:t>WebDriverError@chrome://remote/content/shared/webdriver/Errors.sys.mjs:202:5</w:t>
+      </w:r>
+    </w:p>
+    <w:p>
+      <w:pPr>
+        <w:pStyle w:val="Listing"/>
+      </w:pPr>
+      <w:r>
+        <w:t>NoSuchWindowError@chrome://remote/content/shared/webdriver/Errors.sys.mjs:782:5</w:t>
+      </w:r>
+    </w:p>
+    <w:p>
+      <w:pPr>
+        <w:pStyle w:val="Listing"/>
+      </w:pPr>
+      <w:proofErr w:type="gramStart"/>
+      <w:r>
+        <w:t>assert.that</w:t>
+      </w:r>
+      <w:proofErr w:type="gramEnd"/>
+      <w:r>
+        <w:t>/&lt;@chrome://remote/content/shared/webdriver/Assert.sys.mjs:581:13</w:t>
+      </w:r>
+    </w:p>
+    <w:p>
+      <w:pPr>
+        <w:pStyle w:val="Listing"/>
+      </w:pPr>
+      <w:proofErr w:type="gramStart"/>
+      <w:r>
+        <w:t>assert.open</w:t>
+      </w:r>
+      <w:proofErr w:type="gramEnd"/>
+      <w:r>
+        <w:t>@chrome://remote/content/shared/webdriver/Assert.sys.mjs:169:4</w:t>
+      </w:r>
+    </w:p>
+    <w:p>
+      <w:pPr>
+        <w:pStyle w:val="Listing"/>
+      </w:pPr>
+      <w:proofErr w:type="gramStart"/>
+      <w:r>
+        <w:t>GeckoDriver.prototype.setWindowRect</w:t>
+      </w:r>
+      <w:proofErr w:type="gramEnd"/>
+      <w:r>
+        <w:t>@chrome://remote/content/marionette/driver.sys.mjs:1489:15</w:t>
+      </w:r>
+    </w:p>
+    <w:p>
+      <w:pPr>
+        <w:pStyle w:val="Listing"/>
+      </w:pPr>
+      <w:proofErr w:type="gramStart"/>
+      <w:r>
+        <w:t>dispatch</w:t>
+      </w:r>
+      <w:proofErr w:type="gramEnd"/>
+      <w:r>
+        <w:t>@chrome://remote/content/marionette/server.sys.mjs:318:40</w:t>
+      </w:r>
+    </w:p>
+    <w:p>
+      <w:pPr>
+        <w:pStyle w:val="Listing"/>
+      </w:pPr>
+      <w:proofErr w:type="spellStart"/>
+      <w:proofErr w:type="gramStart"/>
+      <w:r>
+        <w:t>execute</w:t>
+      </w:r>
+      <w:proofErr w:type="gramEnd"/>
+      <w:r>
+        <w:t>@chrome</w:t>
+      </w:r>
+      <w:proofErr w:type="spellEnd"/>
+      <w:r>
+        <w:t>://</w:t>
+      </w:r>
+      <w:proofErr w:type="spellStart"/>
+      <w:r>
+        <w:t>remote</w:t>
+      </w:r>
+      <w:proofErr w:type="spellEnd"/>
+      <w:r>
+        <w:t>/content/</w:t>
+      </w:r>
+      <w:proofErr w:type="spellStart"/>
+      <w:r>
+        <w:t>marionette</w:t>
+      </w:r>
+      <w:proofErr w:type="spellEnd"/>
+      <w:r>
+        <w:t>/server.sys.mjs:289:16</w:t>
+      </w:r>
+    </w:p>
+    <w:p>
+      <w:pPr>
+        <w:pStyle w:val="Listing"/>
+      </w:pPr>
+      <w:proofErr w:type="gramStart"/>
+      <w:r>
+        <w:t>onPacket</w:t>
+      </w:r>
+      <w:proofErr w:type="gramEnd"/>
+      <w:r>
+        <w:t>/&lt;@chrome://remote/content/marionette/server.sys.mjs:262:20</w:t>
+      </w:r>
+    </w:p>
+    <w:p>
+      <w:pPr>
+        <w:pStyle w:val="Listing"/>
+      </w:pPr>
+      <w:proofErr w:type="spellStart"/>
+      <w:proofErr w:type="gramStart"/>
+      <w:r>
+        <w:t>onPacket</w:t>
+      </w:r>
+      <w:proofErr w:type="gramEnd"/>
+      <w:r>
+        <w:t>@chrome</w:t>
+      </w:r>
+      <w:proofErr w:type="spellEnd"/>
+      <w:r>
+        <w:t>://</w:t>
+      </w:r>
+      <w:proofErr w:type="spellStart"/>
+      <w:r>
+        <w:t>remote</w:t>
+      </w:r>
+      <w:proofErr w:type="spellEnd"/>
+      <w:r>
+        <w:t>/content/</w:t>
+      </w:r>
+      <w:proofErr w:type="spellStart"/>
+      <w:r>
+        <w:t>marionette</w:t>
+      </w:r>
+      <w:proofErr w:type="spellEnd"/>
+      <w:r>
+        <w:t>/server.sys.mjs:263:9</w:t>
+      </w:r>
+    </w:p>
+    <w:p>
+      <w:pPr>
+        <w:pStyle w:val="Listing"/>
+      </w:pPr>
+      <w:r>
+        <w:t>_onJSONObjectReady/&lt;@chrome://remote/content/marionette/transport.sys.mjs:494:20</w:t>
+      </w:r>
+    </w:p>
+    <w:p/>
+    <w:p/>
+    <w:p/>
+    <w:p>
+      <w:r>
+        <w:t>Ajout trace :</w:t>
+      </w:r>
+    </w:p>
+    <w:p>
+      <w:pPr>
+        <w:pStyle w:val="Listing"/>
+      </w:pPr>
+      <w:r>
+        <w:t>"""</w:t>
+      </w:r>
+      <w:r>
+        <w:br/>
+        <w:t>Selon Claude:</w:t>
+      </w:r>
+      <w:r>
+        <w:br/>
+        <w:t>Diagnostic : pourquoi le programme ne rend pas la main ?</w:t>
+      </w:r>
+      <w:r>
+        <w:br/>
+        <w:t>C'est probablement l'une de ces causes :</w:t>
+      </w:r>
+      <w:r>
+        <w:br/>
+        <w:t xml:space="preserve">* Threads non-daemon encore en vie après l'exception du thread principal → utilise </w:t>
+      </w:r>
+      <w:proofErr w:type="spellStart"/>
+      <w:r>
+        <w:t>os._exit</w:t>
+      </w:r>
+      <w:proofErr w:type="spellEnd"/>
+      <w:r>
+        <w:t xml:space="preserve">() ou marque tes threads avec </w:t>
+      </w:r>
+      <w:proofErr w:type="spellStart"/>
+      <w:r>
+        <w:t>thread.daemon</w:t>
+      </w:r>
+      <w:proofErr w:type="spellEnd"/>
+      <w:r>
+        <w:t xml:space="preserve"> = True</w:t>
+      </w:r>
+      <w:r>
+        <w:br/>
+        <w:t>* Boucle d'événements (</w:t>
+      </w:r>
+      <w:proofErr w:type="spellStart"/>
+      <w:r>
+        <w:t>asyncio</w:t>
+      </w:r>
+      <w:proofErr w:type="spellEnd"/>
+      <w:r>
+        <w:t xml:space="preserve">, </w:t>
+      </w:r>
+      <w:proofErr w:type="spellStart"/>
+      <w:r>
+        <w:t>tkinter</w:t>
+      </w:r>
+      <w:proofErr w:type="spellEnd"/>
+      <w:r>
+        <w:t>, Qt...) qui tourne toujours</w:t>
+      </w:r>
+      <w:r>
+        <w:br/>
+        <w:t xml:space="preserve">* input() ou un </w:t>
+      </w:r>
+      <w:proofErr w:type="spellStart"/>
+      <w:r>
+        <w:t>socket.accept</w:t>
+      </w:r>
+      <w:proofErr w:type="spellEnd"/>
+      <w:r>
+        <w:t>() en attente sur un autre thread</w:t>
+      </w:r>
+      <w:r>
+        <w:br/>
+        <w:t>"""</w:t>
+      </w:r>
+      <w:r>
+        <w:br/>
+      </w:r>
+      <w:proofErr w:type="spellStart"/>
+      <w:r>
+        <w:t>def</w:t>
+      </w:r>
+      <w:proofErr w:type="spellEnd"/>
+      <w:r>
+        <w:t xml:space="preserve"> </w:t>
+      </w:r>
+      <w:proofErr w:type="spellStart"/>
+      <w:r>
+        <w:t>handle_exception</w:t>
+      </w:r>
+      <w:proofErr w:type="spellEnd"/>
+      <w:r>
+        <w:t>(</w:t>
+      </w:r>
+      <w:proofErr w:type="spellStart"/>
+      <w:r>
+        <w:t>exc_type</w:t>
+      </w:r>
+      <w:proofErr w:type="spellEnd"/>
+      <w:r>
+        <w:t xml:space="preserve">, </w:t>
+      </w:r>
+      <w:proofErr w:type="spellStart"/>
+      <w:r>
+        <w:t>exc_value</w:t>
+      </w:r>
+      <w:proofErr w:type="spellEnd"/>
+      <w:r>
+        <w:t xml:space="preserve">, </w:t>
+      </w:r>
+      <w:proofErr w:type="spellStart"/>
+      <w:r>
+        <w:t>exc_tb</w:t>
+      </w:r>
+      <w:proofErr w:type="spellEnd"/>
+      <w:r>
+        <w:t>):</w:t>
+      </w:r>
+      <w:r>
+        <w:br/>
+        <w:t xml:space="preserve">    </w:t>
+      </w:r>
+      <w:proofErr w:type="spellStart"/>
+      <w:r>
+        <w:t>print</w:t>
+      </w:r>
+      <w:proofErr w:type="spellEnd"/>
+      <w:r>
+        <w:t xml:space="preserve">("\n=== </w:t>
+      </w:r>
+      <w:proofErr w:type="spellStart"/>
+      <w:r>
+        <w:t>handle_exception</w:t>
+      </w:r>
+      <w:proofErr w:type="spellEnd"/>
+      <w:r>
+        <w:t xml:space="preserve"> 1 ===", flush=True)</w:t>
+      </w:r>
+      <w:r>
+        <w:br/>
+        <w:t xml:space="preserve">    </w:t>
+      </w:r>
+      <w:proofErr w:type="spellStart"/>
+      <w:r>
+        <w:t>traceback.print_exception</w:t>
+      </w:r>
+      <w:proofErr w:type="spellEnd"/>
+      <w:r>
+        <w:t>(</w:t>
+      </w:r>
+      <w:proofErr w:type="spellStart"/>
+      <w:r>
+        <w:t>exc_type</w:t>
+      </w:r>
+      <w:proofErr w:type="spellEnd"/>
+      <w:r>
+        <w:t xml:space="preserve">, </w:t>
+      </w:r>
+      <w:proofErr w:type="spellStart"/>
+      <w:r>
+        <w:t>exc_value</w:t>
+      </w:r>
+      <w:proofErr w:type="spellEnd"/>
+      <w:r>
+        <w:t xml:space="preserve">, </w:t>
+      </w:r>
+      <w:proofErr w:type="spellStart"/>
+      <w:r>
+        <w:t>exc_tb</w:t>
+      </w:r>
+      <w:proofErr w:type="spellEnd"/>
+      <w:r>
+        <w:t>)</w:t>
+      </w:r>
+      <w:r>
+        <w:br/>
+        <w:t xml:space="preserve">    </w:t>
+      </w:r>
+      <w:proofErr w:type="spellStart"/>
+      <w:r>
+        <w:t>print</w:t>
+      </w:r>
+      <w:proofErr w:type="spellEnd"/>
+      <w:r>
+        <w:t xml:space="preserve">("\n=== </w:t>
+      </w:r>
+      <w:proofErr w:type="spellStart"/>
+      <w:r>
+        <w:t>handle_exception</w:t>
+      </w:r>
+      <w:proofErr w:type="spellEnd"/>
+      <w:r>
+        <w:t xml:space="preserve"> 2 ===", flush=True)</w:t>
+      </w:r>
+      <w:r>
+        <w:br/>
+        <w:t xml:space="preserve">    </w:t>
+      </w:r>
+      <w:proofErr w:type="spellStart"/>
+      <w:r>
+        <w:t>print</w:t>
+      </w:r>
+      <w:proofErr w:type="spellEnd"/>
+      <w:r>
+        <w:t>("\n=== Threads actifs ===", file=</w:t>
+      </w:r>
+      <w:proofErr w:type="spellStart"/>
+      <w:r>
+        <w:t>sys.stderr</w:t>
+      </w:r>
+      <w:proofErr w:type="spellEnd"/>
+      <w:r>
+        <w:t>)</w:t>
+      </w:r>
+      <w:r>
+        <w:br/>
+        <w:t xml:space="preserve">    for t in </w:t>
+      </w:r>
+      <w:proofErr w:type="spellStart"/>
+      <w:r>
+        <w:t>threading.enumerate</w:t>
+      </w:r>
+      <w:proofErr w:type="spellEnd"/>
+      <w:r>
+        <w:t>():</w:t>
+      </w:r>
+      <w:r>
+        <w:br/>
+        <w:t xml:space="preserve">        </w:t>
+      </w:r>
+      <w:proofErr w:type="spellStart"/>
+      <w:r>
+        <w:t>print</w:t>
+      </w:r>
+      <w:proofErr w:type="spellEnd"/>
+      <w:r>
+        <w:t>(f"  {t.name} daemon={</w:t>
+      </w:r>
+      <w:proofErr w:type="spellStart"/>
+      <w:r>
+        <w:t>t.daemon</w:t>
+      </w:r>
+      <w:proofErr w:type="spellEnd"/>
+      <w:r>
+        <w:t>}", file=</w:t>
+      </w:r>
+      <w:proofErr w:type="spellStart"/>
+      <w:r>
+        <w:t>sys.stderr</w:t>
+      </w:r>
+      <w:proofErr w:type="spellEnd"/>
+      <w:r>
+        <w:t>)</w:t>
+      </w:r>
+      <w:r>
+        <w:br/>
+        <w:t xml:space="preserve">    </w:t>
+      </w:r>
+      <w:proofErr w:type="spellStart"/>
+      <w:r>
+        <w:t>print</w:t>
+      </w:r>
+      <w:proofErr w:type="spellEnd"/>
+      <w:r>
+        <w:t>("\n=== PAUSE... ===", flush=True)</w:t>
+      </w:r>
+      <w:r>
+        <w:br/>
+        <w:t xml:space="preserve">    </w:t>
+      </w:r>
+      <w:proofErr w:type="spellStart"/>
+      <w:r>
+        <w:t>time.sleep</w:t>
+      </w:r>
+      <w:proofErr w:type="spellEnd"/>
+      <w:r>
+        <w:t>(20)</w:t>
+      </w:r>
+      <w:r>
+        <w:br/>
+        <w:t xml:space="preserve">    </w:t>
+      </w:r>
+      <w:proofErr w:type="spellStart"/>
+      <w:r>
+        <w:t>os._exit</w:t>
+      </w:r>
+      <w:proofErr w:type="spellEnd"/>
+      <w:r>
+        <w:t>(1)</w:t>
+      </w:r>
+    </w:p>
+    <w:p>
+      <w:pPr>
+        <w:pStyle w:val="Listing"/>
+      </w:pPr>
+    </w:p>
+    <w:p>
+      <w:r>
+        <w:t>Résultat :</w:t>
+      </w:r>
+    </w:p>
+    <w:p>
+      <w:pPr>
+        <w:pStyle w:val="Listing"/>
+      </w:pPr>
+      <w:r>
+        <w:t xml:space="preserve">2026-03-29 </w:t>
+      </w:r>
+      <w:proofErr w:type="gramStart"/>
+      <w:r>
+        <w:t>21:08:</w:t>
+      </w:r>
+      <w:proofErr w:type="gramEnd"/>
+      <w:r>
+        <w:t xml:space="preserve">07 </w:t>
+      </w:r>
+      <w:proofErr w:type="spellStart"/>
+      <w:proofErr w:type="gramStart"/>
+      <w:r>
+        <w:t>GeneanetSpider</w:t>
+      </w:r>
+      <w:proofErr w:type="spellEnd"/>
+      <w:r>
+        <w:t>[ 116</w:t>
+      </w:r>
+      <w:proofErr w:type="gramEnd"/>
+      <w:r>
+        <w:t xml:space="preserve">] </w:t>
+      </w:r>
+      <w:proofErr w:type="gramStart"/>
+      <w:r>
+        <w:t>INFO:</w:t>
+      </w:r>
+      <w:proofErr w:type="gramEnd"/>
+      <w:r>
+        <w:t xml:space="preserve"> </w:t>
+      </w:r>
+      <w:proofErr w:type="spellStart"/>
+      <w:r>
+        <w:t>Starting</w:t>
+      </w:r>
+      <w:proofErr w:type="spellEnd"/>
+      <w:r>
+        <w:t xml:space="preserve"> </w:t>
+      </w:r>
+      <w:proofErr w:type="spellStart"/>
+      <w:r>
+        <w:t>GeneanetFSpider</w:t>
+      </w:r>
+      <w:proofErr w:type="spellEnd"/>
+      <w:r>
+        <w:t xml:space="preserve"> 2.0.6</w:t>
+      </w:r>
+    </w:p>
+    <w:p>
+      <w:pPr>
+        <w:pStyle w:val="Listing"/>
+      </w:pPr>
+    </w:p>
+    <w:p>
+      <w:pPr>
+        <w:pStyle w:val="Listing"/>
+      </w:pPr>
+      <w:r>
+        <w:t xml:space="preserve">=== </w:t>
+      </w:r>
+      <w:proofErr w:type="spellStart"/>
+      <w:r>
+        <w:t>handle_exception</w:t>
+      </w:r>
+      <w:proofErr w:type="spellEnd"/>
+      <w:r>
+        <w:t xml:space="preserve"> 1 ===</w:t>
+      </w:r>
+    </w:p>
+    <w:p>
+      <w:pPr>
+        <w:pStyle w:val="Listing"/>
+      </w:pPr>
+      <w:proofErr w:type="spellStart"/>
+      <w:r>
+        <w:t>Traceback</w:t>
+      </w:r>
+      <w:proofErr w:type="spellEnd"/>
+      <w:r>
+        <w:t xml:space="preserve"> (</w:t>
+      </w:r>
+      <w:proofErr w:type="spellStart"/>
+      <w:r>
+        <w:t>most</w:t>
+      </w:r>
+      <w:proofErr w:type="spellEnd"/>
+      <w:r>
+        <w:t xml:space="preserve"> </w:t>
+      </w:r>
+      <w:proofErr w:type="spellStart"/>
+      <w:r>
+        <w:t>recent</w:t>
+      </w:r>
+      <w:proofErr w:type="spellEnd"/>
+      <w:r>
+        <w:t xml:space="preserve"> call last</w:t>
+      </w:r>
+      <w:proofErr w:type="gramStart"/>
+      <w:r>
+        <w:t>):</w:t>
+      </w:r>
+      <w:proofErr w:type="gramEnd"/>
+    </w:p>
+    <w:p>
+      <w:pPr>
+        <w:pStyle w:val="Listing"/>
+      </w:pPr>
+      <w:r>
+        <w:t xml:space="preserve">  File "D:\Users\Nicolas\Documents\Python\geneanet_v2\geneanet\spiders\geneanet_spider.py", line 1213, in &lt;module&gt;</w:t>
+      </w:r>
+    </w:p>
+    <w:p>
+      <w:pPr>
+        <w:pStyle w:val="Listing"/>
+      </w:pPr>
+      <w:r>
+        <w:t xml:space="preserve">    </w:t>
+      </w:r>
+      <w:proofErr w:type="gramStart"/>
+      <w:r>
+        <w:t>crawler</w:t>
+      </w:r>
+      <w:proofErr w:type="gramEnd"/>
+      <w:r>
+        <w:t xml:space="preserve"> = </w:t>
+      </w:r>
+      <w:proofErr w:type="spellStart"/>
+      <w:proofErr w:type="gramStart"/>
+      <w:r>
+        <w:t>GeneanetSpider</w:t>
+      </w:r>
+      <w:proofErr w:type="spellEnd"/>
+      <w:r>
+        <w:t xml:space="preserve">( </w:t>
+      </w:r>
+      <w:proofErr w:type="spellStart"/>
+      <w:r>
+        <w:t>max</w:t>
+      </w:r>
+      <w:proofErr w:type="gramEnd"/>
+      <w:r>
+        <w:t>_pages</w:t>
+      </w:r>
+      <w:proofErr w:type="spellEnd"/>
+      <w:r>
+        <w:t>=</w:t>
+      </w:r>
+      <w:proofErr w:type="spellStart"/>
+      <w:r>
+        <w:t>args.max_pages</w:t>
+      </w:r>
+      <w:proofErr w:type="spellEnd"/>
+      <w:r>
+        <w:t xml:space="preserve">, </w:t>
+      </w:r>
+      <w:proofErr w:type="spellStart"/>
+      <w:r>
+        <w:t>max_cloudflare_errors</w:t>
+      </w:r>
+      <w:proofErr w:type="spellEnd"/>
+      <w:r>
+        <w:t>=</w:t>
+      </w:r>
+      <w:proofErr w:type="spellStart"/>
+      <w:r>
+        <w:t>args.max_cloudflare_errors</w:t>
+      </w:r>
+      <w:proofErr w:type="spellEnd"/>
+      <w:r>
+        <w:t xml:space="preserve">, </w:t>
+      </w:r>
+      <w:proofErr w:type="spellStart"/>
+      <w:r>
+        <w:t>min_delay</w:t>
+      </w:r>
+      <w:proofErr w:type="spellEnd"/>
+      <w:r>
+        <w:t>=</w:t>
+      </w:r>
+      <w:proofErr w:type="spellStart"/>
+      <w:r>
+        <w:t>args.min_delay</w:t>
+      </w:r>
+      <w:proofErr w:type="spellEnd"/>
+      <w:r>
+        <w:t xml:space="preserve">, </w:t>
+      </w:r>
+      <w:proofErr w:type="spellStart"/>
+      <w:r>
+        <w:t>max_delay</w:t>
+      </w:r>
+      <w:proofErr w:type="spellEnd"/>
+      <w:r>
+        <w:t>=</w:t>
+      </w:r>
+      <w:proofErr w:type="spellStart"/>
+      <w:r>
+        <w:t>args.max_delay</w:t>
+      </w:r>
+      <w:proofErr w:type="spellEnd"/>
+      <w:r>
+        <w:t xml:space="preserve">, </w:t>
+      </w:r>
+      <w:proofErr w:type="spellStart"/>
+      <w:r>
+        <w:t>headless</w:t>
+      </w:r>
+      <w:proofErr w:type="spellEnd"/>
+      <w:r>
+        <w:t>=</w:t>
+      </w:r>
+      <w:proofErr w:type="spellStart"/>
+      <w:proofErr w:type="gramStart"/>
+      <w:r>
+        <w:t>args.headless</w:t>
+      </w:r>
+      <w:proofErr w:type="spellEnd"/>
+      <w:proofErr w:type="gramEnd"/>
+      <w:r>
+        <w:t xml:space="preserve"> )</w:t>
+      </w:r>
+    </w:p>
+    <w:p>
+      <w:pPr>
+        <w:pStyle w:val="Listing"/>
+      </w:pPr>
+      <w:r>
+        <w:t xml:space="preserve">              ^^^^^^^^^^^^^^^^^^^^^^^^^^^^^^^^^^^^^^^^^^^^^^^^^^^^^^^^^^^^^^^^^^^^^^^^^^^^^^^^^^^^^^^^^^^^^^^^^^^^^^^^^^^^^^^^^^^^^^^^^^^^^^^^^^^^^^^^^^^^^^^^^^^^^^^^^^^^^^^^^^^^^^^^</w:t>
+      </w:r>
+    </w:p>
+    <w:p>
+      <w:pPr>
+        <w:pStyle w:val="Listing"/>
+      </w:pPr>
+      <w:r>
+        <w:t xml:space="preserve">  File "D:\Users\Nicolas\Documents\Python\geneanet_v2\geneanet\spiders\geneanet_spider.py", line 118, in __init__</w:t>
+      </w:r>
+    </w:p>
+    <w:p>
+      <w:pPr>
+        <w:pStyle w:val="Listing"/>
+      </w:pPr>
+      <w:r>
+        <w:t xml:space="preserve">    </w:t>
+      </w:r>
+      <w:proofErr w:type="gramStart"/>
+      <w:r>
+        <w:t>super()._</w:t>
+      </w:r>
+      <w:proofErr w:type="gramEnd"/>
+      <w:r>
+        <w:t>_init_</w:t>
+      </w:r>
+      <w:proofErr w:type="gramStart"/>
+      <w:r>
+        <w:t>_(</w:t>
+      </w:r>
+      <w:proofErr w:type="spellStart"/>
+      <w:proofErr w:type="gramEnd"/>
+      <w:r>
+        <w:t>max_pages</w:t>
+      </w:r>
+      <w:proofErr w:type="spellEnd"/>
+      <w:r>
+        <w:t>=</w:t>
+      </w:r>
+      <w:proofErr w:type="spellStart"/>
+      <w:r>
+        <w:t>max_pages</w:t>
+      </w:r>
+      <w:proofErr w:type="spellEnd"/>
+      <w:r>
+        <w:t xml:space="preserve">, </w:t>
+      </w:r>
+      <w:proofErr w:type="spellStart"/>
+      <w:r>
+        <w:t>max_cloudflare_errors</w:t>
+      </w:r>
+      <w:proofErr w:type="spellEnd"/>
+      <w:r>
+        <w:t>=</w:t>
+      </w:r>
+      <w:proofErr w:type="spellStart"/>
+      <w:r>
+        <w:t>max_cloudflare_errors</w:t>
+      </w:r>
+      <w:proofErr w:type="spellEnd"/>
+      <w:r>
+        <w:t xml:space="preserve">, </w:t>
+      </w:r>
+      <w:proofErr w:type="spellStart"/>
+      <w:r>
+        <w:t>min_delay</w:t>
+      </w:r>
+      <w:proofErr w:type="spellEnd"/>
+      <w:r>
+        <w:t>=</w:t>
+      </w:r>
+      <w:proofErr w:type="spellStart"/>
+      <w:r>
+        <w:t>min_delay</w:t>
+      </w:r>
+      <w:proofErr w:type="spellEnd"/>
+      <w:r>
+        <w:t xml:space="preserve">, </w:t>
+      </w:r>
+      <w:proofErr w:type="spellStart"/>
+      <w:r>
+        <w:t>max_delay</w:t>
+      </w:r>
+      <w:proofErr w:type="spellEnd"/>
+      <w:r>
+        <w:t>=</w:t>
+      </w:r>
+      <w:proofErr w:type="spellStart"/>
+      <w:r>
+        <w:t>max_delay</w:t>
+      </w:r>
+      <w:proofErr w:type="spellEnd"/>
+      <w:r>
+        <w:t xml:space="preserve">, </w:t>
+      </w:r>
+      <w:proofErr w:type="spellStart"/>
+      <w:r>
+        <w:t>headless</w:t>
+      </w:r>
+      <w:proofErr w:type="spellEnd"/>
+      <w:r>
+        <w:t>=</w:t>
+      </w:r>
+      <w:proofErr w:type="spellStart"/>
+      <w:r>
+        <w:t>headless</w:t>
+      </w:r>
+      <w:proofErr w:type="spellEnd"/>
+      <w:r>
+        <w:t>)</w:t>
+      </w:r>
+    </w:p>
+    <w:p>
+      <w:pPr>
+        <w:pStyle w:val="Listing"/>
+      </w:pPr>
+      <w:r>
+        <w:t xml:space="preserve">  File "D:\Users\Nicolas\Documents\Python\geneanet_v2\geneanet\crawler.py", line 122, in __init__</w:t>
+      </w:r>
+    </w:p>
+    <w:p>
+      <w:pPr>
+        <w:pStyle w:val="Listing"/>
+      </w:pPr>
+      <w:r>
+        <w:t xml:space="preserve">    </w:t>
+      </w:r>
+      <w:proofErr w:type="gramStart"/>
+      <w:r>
+        <w:t>self._</w:t>
+      </w:r>
+      <w:proofErr w:type="spellStart"/>
+      <w:proofErr w:type="gramEnd"/>
+      <w:r>
+        <w:t>init_</w:t>
+      </w:r>
+      <w:proofErr w:type="gramStart"/>
+      <w:r>
+        <w:t>driver</w:t>
+      </w:r>
+      <w:proofErr w:type="spellEnd"/>
+      <w:r>
+        <w:t>(</w:t>
+      </w:r>
+      <w:proofErr w:type="gramEnd"/>
+      <w:r>
+        <w:t>)</w:t>
+      </w:r>
+    </w:p>
+    <w:p>
+      <w:pPr>
+        <w:pStyle w:val="Listing"/>
+      </w:pPr>
+      <w:r>
+        <w:t xml:space="preserve">  File "D:\Users\Nicolas\Documents\Python\geneanet_v2\geneanet\crawler.py", line 158, in _</w:t>
+      </w:r>
+      <w:proofErr w:type="spellStart"/>
+      <w:r>
+        <w:t>init_driver</w:t>
+      </w:r>
+      <w:proofErr w:type="spellEnd"/>
+    </w:p>
+    <w:p>
+      <w:pPr>
+        <w:pStyle w:val="Listing"/>
+      </w:pPr>
+      <w:r>
+        <w:t xml:space="preserve">    </w:t>
+      </w:r>
+      <w:proofErr w:type="spellStart"/>
+      <w:r>
+        <w:t>self.driver.set_window_</w:t>
+      </w:r>
+      <w:proofErr w:type="gramStart"/>
+      <w:r>
+        <w:t>size</w:t>
+      </w:r>
+      <w:proofErr w:type="spellEnd"/>
+      <w:r>
+        <w:t>(</w:t>
+      </w:r>
+      <w:proofErr w:type="gramEnd"/>
+      <w:r>
+        <w:t>1280, 800)</w:t>
+      </w:r>
+    </w:p>
+    <w:p>
+      <w:pPr>
+        <w:pStyle w:val="Listing"/>
+      </w:pPr>
+      <w:r>
+        <w:t xml:space="preserve">  File "C:\Users\Nicolas\.conda\envs\scrapy\Lib\site-packages\selenium\webdriver\remote\webdriver.py", line 928, in </w:t>
+      </w:r>
+      <w:proofErr w:type="spellStart"/>
+      <w:r>
+        <w:t>set_window_size</w:t>
+      </w:r>
+      <w:proofErr w:type="spellEnd"/>
+    </w:p>
+    <w:p>
+      <w:pPr>
+        <w:pStyle w:val="Listing"/>
+      </w:pPr>
+      <w:r>
+        <w:t xml:space="preserve">    </w:t>
+      </w:r>
+      <w:proofErr w:type="spellStart"/>
+      <w:r>
+        <w:t>self.set_window_rect</w:t>
+      </w:r>
+      <w:proofErr w:type="spellEnd"/>
+      <w:r>
+        <w:t>(</w:t>
+      </w:r>
+      <w:proofErr w:type="spellStart"/>
+      <w:r>
+        <w:t>width</w:t>
+      </w:r>
+      <w:proofErr w:type="spellEnd"/>
+      <w:r>
+        <w:t>=</w:t>
+      </w:r>
+      <w:proofErr w:type="spellStart"/>
+      <w:r>
+        <w:t>int</w:t>
+      </w:r>
+      <w:proofErr w:type="spellEnd"/>
+      <w:r>
+        <w:t>(</w:t>
+      </w:r>
+      <w:proofErr w:type="spellStart"/>
+      <w:r>
+        <w:t>width</w:t>
+      </w:r>
+      <w:proofErr w:type="spellEnd"/>
+      <w:r>
+        <w:t xml:space="preserve">), </w:t>
+      </w:r>
+      <w:proofErr w:type="spellStart"/>
+      <w:r>
+        <w:t>height</w:t>
+      </w:r>
+      <w:proofErr w:type="spellEnd"/>
+      <w:r>
+        <w:t>=</w:t>
+      </w:r>
+      <w:proofErr w:type="spellStart"/>
+      <w:r>
+        <w:t>int</w:t>
+      </w:r>
+      <w:proofErr w:type="spellEnd"/>
+      <w:r>
+        <w:t>(</w:t>
+      </w:r>
+      <w:proofErr w:type="spellStart"/>
+      <w:r>
+        <w:t>height</w:t>
+      </w:r>
+      <w:proofErr w:type="spellEnd"/>
+      <w:r>
+        <w:t>))</w:t>
+      </w:r>
+    </w:p>
+    <w:p>
+      <w:pPr>
+        <w:pStyle w:val="Listing"/>
+      </w:pPr>
+      <w:r>
+        <w:t xml:space="preserve">  File "C:\Users\Nicolas\.conda\envs\scrapy\Lib\site-packages\selenium\webdriver\remote\webdriver.py", line 1000, in </w:t>
+      </w:r>
+      <w:proofErr w:type="spellStart"/>
+      <w:r>
+        <w:t>set_window_rect</w:t>
+      </w:r>
+      <w:proofErr w:type="spellEnd"/>
+    </w:p>
+    <w:p>
+      <w:pPr>
+        <w:pStyle w:val="Listing"/>
+      </w:pPr>
+      <w:r>
+        <w:t xml:space="preserve">    </w:t>
+      </w:r>
+      <w:proofErr w:type="gramStart"/>
+      <w:r>
+        <w:t>return</w:t>
+      </w:r>
+      <w:proofErr w:type="gramEnd"/>
+      <w:r>
+        <w:t xml:space="preserve"> </w:t>
+      </w:r>
+      <w:proofErr w:type="spellStart"/>
+      <w:proofErr w:type="gramStart"/>
+      <w:r>
+        <w:t>self.execute</w:t>
+      </w:r>
+      <w:proofErr w:type="spellEnd"/>
+      <w:proofErr w:type="gramEnd"/>
+      <w:r>
+        <w:t>(</w:t>
+      </w:r>
+      <w:proofErr w:type="spellStart"/>
+      <w:r>
+        <w:t>Command.SET_WINDOW_RECT</w:t>
+      </w:r>
+      <w:proofErr w:type="spellEnd"/>
+      <w:r>
+        <w:t>, {"x</w:t>
+      </w:r>
+      <w:proofErr w:type="gramStart"/>
+      <w:r>
+        <w:t>":</w:t>
+      </w:r>
+      <w:proofErr w:type="gramEnd"/>
+      <w:r>
+        <w:t xml:space="preserve"> x, "y</w:t>
+      </w:r>
+      <w:proofErr w:type="gramStart"/>
+      <w:r>
+        <w:t>":</w:t>
+      </w:r>
+      <w:proofErr w:type="gramEnd"/>
+      <w:r>
+        <w:t xml:space="preserve"> y, "</w:t>
+      </w:r>
+      <w:proofErr w:type="spellStart"/>
+      <w:r>
+        <w:t>width</w:t>
+      </w:r>
+      <w:proofErr w:type="spellEnd"/>
+      <w:proofErr w:type="gramStart"/>
+      <w:r>
+        <w:t>":</w:t>
+      </w:r>
+      <w:proofErr w:type="gramEnd"/>
+      <w:r>
+        <w:t xml:space="preserve"> </w:t>
+      </w:r>
+      <w:proofErr w:type="spellStart"/>
+      <w:r>
+        <w:t>width</w:t>
+      </w:r>
+      <w:proofErr w:type="spellEnd"/>
+      <w:r>
+        <w:t>, "</w:t>
+      </w:r>
+      <w:proofErr w:type="spellStart"/>
+      <w:r>
+        <w:t>height</w:t>
+      </w:r>
+      <w:proofErr w:type="spellEnd"/>
+      <w:proofErr w:type="gramStart"/>
+      <w:r>
+        <w:t>":</w:t>
+      </w:r>
+      <w:proofErr w:type="gramEnd"/>
+      <w:r>
+        <w:t xml:space="preserve"> </w:t>
+      </w:r>
+      <w:proofErr w:type="spellStart"/>
+      <w:r>
+        <w:t>height</w:t>
+      </w:r>
+      <w:proofErr w:type="spellEnd"/>
+      <w:proofErr w:type="gramStart"/>
+      <w:r>
+        <w:t>})[</w:t>
+      </w:r>
+      <w:proofErr w:type="gramEnd"/>
+      <w:r>
+        <w:t>"value"]</w:t>
+      </w:r>
+    </w:p>
+    <w:p>
+      <w:pPr>
+        <w:pStyle w:val="Listing"/>
+      </w:pPr>
+      <w:r>
+        <w:lastRenderedPageBreak/>
+        <w:t xml:space="preserve">           ^^^^^^^^^^^^^^^^^^^^^^^^^^^^^^^^^^^^^^^^^^^^^^^^^^^^^^^^^^^^^^^^^^^^^^^^^^^^^^^^^^^^^^^^^</w:t>
+      </w:r>
+    </w:p>
+    <w:p>
+      <w:pPr>
+        <w:pStyle w:val="Listing"/>
+      </w:pPr>
+      <w:r>
+        <w:t xml:space="preserve">  File "C:\Users\Nicolas\.conda\envs\scrapy\Lib\site-packages\selenium\webdriver\remote\webdriver.py", line 446, in </w:t>
+      </w:r>
+      <w:proofErr w:type="spellStart"/>
+      <w:r>
+        <w:t>execute</w:t>
+      </w:r>
+      <w:proofErr w:type="spellEnd"/>
+    </w:p>
+    <w:p>
+      <w:pPr>
+        <w:pStyle w:val="Listing"/>
+      </w:pPr>
+      <w:r>
+        <w:t xml:space="preserve">    </w:t>
+      </w:r>
+      <w:proofErr w:type="spellStart"/>
+      <w:proofErr w:type="gramStart"/>
+      <w:r>
+        <w:t>self.error</w:t>
+      </w:r>
+      <w:proofErr w:type="gramEnd"/>
+      <w:r>
+        <w:t>_</w:t>
+      </w:r>
+      <w:proofErr w:type="gramStart"/>
+      <w:r>
+        <w:t>handler.check</w:t>
+      </w:r>
+      <w:proofErr w:type="gramEnd"/>
+      <w:r>
+        <w:t>_response</w:t>
+      </w:r>
+      <w:proofErr w:type="spellEnd"/>
+      <w:r>
+        <w:t>(</w:t>
+      </w:r>
+      <w:proofErr w:type="spellStart"/>
+      <w:r>
+        <w:t>response</w:t>
+      </w:r>
+      <w:proofErr w:type="spellEnd"/>
+      <w:r>
+        <w:t>)</w:t>
+      </w:r>
+    </w:p>
+    <w:p>
+      <w:pPr>
+        <w:pStyle w:val="Listing"/>
+      </w:pPr>
+      <w:r>
+        <w:t xml:space="preserve">  File "C:\Users\Nicolas\.conda\envs\scrapy\Lib\site-packages\selenium\webdriver\remote\errorhandler.py", line 232, in </w:t>
+      </w:r>
+      <w:proofErr w:type="spellStart"/>
+      <w:r>
+        <w:t>check_response</w:t>
+      </w:r>
+      <w:proofErr w:type="spellEnd"/>
+    </w:p>
+    <w:p>
+      <w:pPr>
+        <w:pStyle w:val="Listing"/>
+      </w:pPr>
+      <w:r>
+        <w:t xml:space="preserve">    </w:t>
+      </w:r>
+      <w:proofErr w:type="spellStart"/>
+      <w:proofErr w:type="gramStart"/>
+      <w:r>
+        <w:t>raise</w:t>
+      </w:r>
+      <w:proofErr w:type="spellEnd"/>
+      <w:proofErr w:type="gramEnd"/>
+      <w:r>
+        <w:t xml:space="preserve"> </w:t>
+      </w:r>
+      <w:proofErr w:type="spellStart"/>
+      <w:r>
+        <w:t>exception_</w:t>
+      </w:r>
+      <w:proofErr w:type="gramStart"/>
+      <w:r>
+        <w:t>class</w:t>
+      </w:r>
+      <w:proofErr w:type="spellEnd"/>
+      <w:r>
+        <w:t>(</w:t>
+      </w:r>
+      <w:proofErr w:type="gramEnd"/>
+      <w:r>
+        <w:t xml:space="preserve">message, screen, </w:t>
+      </w:r>
+      <w:proofErr w:type="spellStart"/>
+      <w:r>
+        <w:t>stacktrace</w:t>
+      </w:r>
+      <w:proofErr w:type="spellEnd"/>
+      <w:r>
+        <w:t>)</w:t>
+      </w:r>
+    </w:p>
+    <w:p>
+      <w:pPr>
+        <w:pStyle w:val="Listing"/>
+      </w:pPr>
+      <w:proofErr w:type="spellStart"/>
+      <w:proofErr w:type="gramStart"/>
+      <w:r>
+        <w:t>selenium.common</w:t>
+      </w:r>
+      <w:proofErr w:type="gramEnd"/>
+      <w:r>
+        <w:t>.</w:t>
+      </w:r>
+      <w:proofErr w:type="gramStart"/>
+      <w:r>
+        <w:t>exceptions.NoSuchWindowException</w:t>
+      </w:r>
+      <w:proofErr w:type="spellEnd"/>
+      <w:proofErr w:type="gramEnd"/>
+      <w:r>
+        <w:t xml:space="preserve">: </w:t>
+      </w:r>
+      <w:proofErr w:type="gramStart"/>
+      <w:r>
+        <w:t>Message:</w:t>
+      </w:r>
+      <w:proofErr w:type="gramEnd"/>
+      <w:r>
+        <w:t xml:space="preserve"> </w:t>
+      </w:r>
+      <w:proofErr w:type="spellStart"/>
+      <w:r>
+        <w:t>Browsing</w:t>
+      </w:r>
+      <w:proofErr w:type="spellEnd"/>
+      <w:r>
+        <w:t xml:space="preserve"> </w:t>
+      </w:r>
+      <w:proofErr w:type="spellStart"/>
+      <w:r>
+        <w:t>context</w:t>
+      </w:r>
+      <w:proofErr w:type="spellEnd"/>
+      <w:r>
+        <w:t xml:space="preserve"> has been </w:t>
+      </w:r>
+      <w:proofErr w:type="spellStart"/>
+      <w:r>
+        <w:t>discarded</w:t>
+      </w:r>
+      <w:proofErr w:type="spellEnd"/>
+    </w:p>
+    <w:p>
+      <w:pPr>
+        <w:pStyle w:val="Listing"/>
+      </w:pPr>
+      <w:proofErr w:type="spellStart"/>
+      <w:proofErr w:type="gramStart"/>
+      <w:r>
+        <w:t>Stacktrace</w:t>
+      </w:r>
+      <w:proofErr w:type="spellEnd"/>
+      <w:r>
+        <w:t>:</w:t>
+      </w:r>
+      <w:proofErr w:type="gramEnd"/>
+    </w:p>
+    <w:p>
+      <w:pPr>
+        <w:pStyle w:val="Listing"/>
+      </w:pPr>
+      <w:r>
+        <w:t>RemoteError@chrome://remote/content/shared/RemoteError.sys.mjs:8:8</w:t>
+      </w:r>
+    </w:p>
+    <w:p>
+      <w:pPr>
+        <w:pStyle w:val="Listing"/>
+      </w:pPr>
+      <w:r>
+        <w:t>WebDriverError@chrome://remote/content/shared/webdriver/Errors.sys.mjs:202:5</w:t>
+      </w:r>
+    </w:p>
+    <w:p>
+      <w:pPr>
+        <w:pStyle w:val="Listing"/>
+      </w:pPr>
+      <w:r>
+        <w:t>NoSuchWindowError@chrome://remote/content/shared/webdriver/Errors.sys.mjs:782:5</w:t>
+      </w:r>
+    </w:p>
+    <w:p>
+      <w:pPr>
+        <w:pStyle w:val="Listing"/>
+      </w:pPr>
+      <w:proofErr w:type="gramStart"/>
+      <w:r>
+        <w:t>assert.that</w:t>
+      </w:r>
+      <w:proofErr w:type="gramEnd"/>
+      <w:r>
+        <w:t>/&lt;@chrome://remote/content/shared/webdriver/Assert.sys.mjs:581:13</w:t>
+      </w:r>
+    </w:p>
+    <w:p>
+      <w:pPr>
+        <w:pStyle w:val="Listing"/>
+      </w:pPr>
+      <w:proofErr w:type="gramStart"/>
+      <w:r>
+        <w:t>assert.open</w:t>
+      </w:r>
+      <w:proofErr w:type="gramEnd"/>
+      <w:r>
+        <w:t>@chrome://remote/content/shared/webdriver/Assert.sys.mjs:169:4</w:t>
+      </w:r>
+    </w:p>
+    <w:p>
+      <w:pPr>
+        <w:pStyle w:val="Listing"/>
+      </w:pPr>
+      <w:proofErr w:type="gramStart"/>
+      <w:r>
+        <w:t>GeckoDriver.prototype.setWindowRect</w:t>
+      </w:r>
+      <w:proofErr w:type="gramEnd"/>
+      <w:r>
+        <w:t>@chrome://remote/content/marionette/driver.sys.mjs:1489:15</w:t>
+      </w:r>
+    </w:p>
+    <w:p>
+      <w:pPr>
+        <w:pStyle w:val="Listing"/>
+      </w:pPr>
+      <w:proofErr w:type="gramStart"/>
+      <w:r>
+        <w:t>dispatch</w:t>
+      </w:r>
+      <w:proofErr w:type="gramEnd"/>
+      <w:r>
+        <w:t>@chrome://remote/content/marionette/server.sys.mjs:318:40</w:t>
+      </w:r>
+    </w:p>
+    <w:p>
+      <w:pPr>
+        <w:pStyle w:val="Listing"/>
+      </w:pPr>
+      <w:proofErr w:type="spellStart"/>
+      <w:proofErr w:type="gramStart"/>
+      <w:r>
+        <w:t>execute</w:t>
+      </w:r>
+      <w:proofErr w:type="gramEnd"/>
+      <w:r>
+        <w:t>@chrome</w:t>
+      </w:r>
+      <w:proofErr w:type="spellEnd"/>
+      <w:r>
+        <w:t>://</w:t>
+      </w:r>
+      <w:proofErr w:type="spellStart"/>
+      <w:r>
+        <w:t>remote</w:t>
+      </w:r>
+      <w:proofErr w:type="spellEnd"/>
+      <w:r>
+        <w:t>/content/</w:t>
+      </w:r>
+      <w:proofErr w:type="spellStart"/>
+      <w:r>
+        <w:t>marionette</w:t>
+      </w:r>
+      <w:proofErr w:type="spellEnd"/>
+      <w:r>
+        <w:t>/server.sys.mjs:289:16</w:t>
+      </w:r>
+    </w:p>
+    <w:p>
+      <w:pPr>
+        <w:pStyle w:val="Listing"/>
+      </w:pPr>
+      <w:proofErr w:type="gramStart"/>
+      <w:r>
+        <w:t>onPacket</w:t>
+      </w:r>
+      <w:proofErr w:type="gramEnd"/>
+      <w:r>
+        <w:t>/&lt;@chrome://remote/content/marionette/server.sys.mjs:262:20</w:t>
+      </w:r>
+    </w:p>
+    <w:p>
+      <w:pPr>
+        <w:pStyle w:val="Listing"/>
+      </w:pPr>
+      <w:proofErr w:type="spellStart"/>
+      <w:proofErr w:type="gramStart"/>
+      <w:r>
+        <w:t>onPacket</w:t>
+      </w:r>
+      <w:proofErr w:type="gramEnd"/>
+      <w:r>
+        <w:t>@chrome</w:t>
+      </w:r>
+      <w:proofErr w:type="spellEnd"/>
+      <w:r>
+        <w:t>://</w:t>
+      </w:r>
+      <w:proofErr w:type="spellStart"/>
+      <w:r>
+        <w:t>remote</w:t>
+      </w:r>
+      <w:proofErr w:type="spellEnd"/>
+      <w:r>
+        <w:t>/content/</w:t>
+      </w:r>
+      <w:proofErr w:type="spellStart"/>
+      <w:r>
+        <w:t>marionette</w:t>
+      </w:r>
+      <w:proofErr w:type="spellEnd"/>
+      <w:r>
+        <w:t>/server.sys.mjs:263:9</w:t>
+      </w:r>
+    </w:p>
+    <w:p>
+      <w:pPr>
+        <w:pStyle w:val="Listing"/>
+      </w:pPr>
+      <w:r>
+        <w:t>_onJSONObjectReady/&lt;@chrome://remote/content/marionette/transport.sys.mjs:494:20</w:t>
+      </w:r>
+    </w:p>
+    <w:p>
+      <w:pPr>
+        <w:pStyle w:val="Listing"/>
+      </w:pPr>
+    </w:p>
+    <w:p>
+      <w:pPr>
+        <w:pStyle w:val="Listing"/>
+      </w:pPr>
+    </w:p>
+    <w:p>
+      <w:pPr>
+        <w:pStyle w:val="Listing"/>
+      </w:pPr>
+      <w:r>
+        <w:t xml:space="preserve">=== </w:t>
+      </w:r>
+      <w:proofErr w:type="spellStart"/>
+      <w:r>
+        <w:t>handle_exception</w:t>
+      </w:r>
+      <w:proofErr w:type="spellEnd"/>
+      <w:r>
+        <w:t xml:space="preserve"> 2 ===</w:t>
+      </w:r>
+    </w:p>
+    <w:p>
+      <w:pPr>
+        <w:pStyle w:val="Listing"/>
+      </w:pPr>
+    </w:p>
+    <w:p>
+      <w:pPr>
+        <w:pStyle w:val="Listing"/>
+      </w:pPr>
+      <w:r>
+        <w:t>=== Threads actifs ===</w:t>
+      </w:r>
+    </w:p>
+    <w:p>
+      <w:pPr>
+        <w:pStyle w:val="Listing"/>
+      </w:pPr>
+      <w:r>
+        <w:t xml:space="preserve">  </w:t>
+      </w:r>
+      <w:proofErr w:type="spellStart"/>
+      <w:r>
+        <w:t>MainThread</w:t>
+      </w:r>
+      <w:proofErr w:type="spellEnd"/>
+      <w:r>
+        <w:t xml:space="preserve"> daemon=False</w:t>
+      </w:r>
+    </w:p>
+    <w:p>
+      <w:pPr>
+        <w:pStyle w:val="Listing"/>
+      </w:pPr>
+    </w:p>
+    <w:p>
+      <w:pPr>
+        <w:pStyle w:val="Listing"/>
+      </w:pPr>
+      <w:r>
+        <w:t>=== PAUSE... ===</w:t>
+      </w:r>
     </w:p>
     <w:p/>
     <w:p/>
@@ -20264,16 +22455,7 @@
           <w:sz w:val="28"/>
           <w:szCs w:val="28"/>
         </w:rPr>
-        <w:t xml:space="preserve"> </w:t>
-      </w:r>
-      <w:r>
-        <w:rPr>
-          <w:b/>
-          <w:bCs/>
-          <w:sz w:val="28"/>
-          <w:szCs w:val="28"/>
-        </w:rPr>
-        <w:t>dédié</w:t>
+        <w:t xml:space="preserve"> dédié</w:t>
       </w:r>
     </w:p>
     <w:p/>
@@ -33784,24 +35966,12 @@
       <w:r>
         <w:t xml:space="preserve"> </w:t>
       </w:r>
-      <w:hyperlink r:id="rId12" w:history="1">
+      <w:hyperlink r:id="rId12" w:anchor="channel-locations-channels" w:history="1">
         <w:r>
           <w:rPr>
             <w:rStyle w:val="Lienhypertexte"/>
           </w:rPr>
-          <w:t>https://docs.conda.io/pro</w:t>
-        </w:r>
-        <w:r>
-          <w:rPr>
-            <w:rStyle w:val="Lienhypertexte"/>
-          </w:rPr>
-          <w:t>j</w:t>
-        </w:r>
-        <w:r>
-          <w:rPr>
-            <w:rStyle w:val="Lienhypertexte"/>
-          </w:rPr>
-          <w:t>ects/conda/en/stable/user-guide/configuration/use-condarc.html#channel-locations-channels</w:t>
+          <w:t>https://docs.conda.io/projects/conda/en/stable/user-guide/configuration/use-condarc.html#channel-locations-channels</w:t>
         </w:r>
       </w:hyperlink>
     </w:p>
@@ -33817,7 +35987,7 @@
       <w:r>
         <w:t xml:space="preserve"> </w:t>
       </w:r>
-      <w:hyperlink r:id="rId13" w:history="1">
+      <w:hyperlink r:id="rId13" w:anchor="specifying-channels-when-installing-packages" w:history="1">
         <w:r>
           <w:rPr>
             <w:rStyle w:val="Lienhypertexte"/>
@@ -38292,6 +40462,9 @@
     <w:p/>
     <w:p>
       <w:r>
+        <w:rPr>
+          <w:noProof/>
+        </w:rPr>
         <w:drawing>
           <wp:inline distT="0" distB="0" distL="0" distR="0" wp14:anchorId="6C15841B" wp14:editId="6B556B2D">
             <wp:extent cx="6188710" cy="2578735"/>
@@ -38331,6 +40504,9 @@
     </w:p>
     <w:p>
       <w:r>
+        <w:rPr>
+          <w:noProof/>
+        </w:rPr>
         <w:drawing>
           <wp:inline distT="0" distB="0" distL="0" distR="0" wp14:anchorId="5ACD9B6E" wp14:editId="590C8EA2">
             <wp:extent cx="6188710" cy="2046605"/>
@@ -38370,6 +40546,9 @@
     </w:p>
     <w:p>
       <w:r>
+        <w:rPr>
+          <w:noProof/>
+        </w:rPr>
         <w:lastRenderedPageBreak/>
         <w:drawing>
           <wp:inline distT="0" distB="0" distL="0" distR="0" wp14:anchorId="0CD003F7" wp14:editId="0DCCE746">
@@ -38425,6 +40604,9 @@
     <w:p/>
     <w:p>
       <w:r>
+        <w:rPr>
+          <w:noProof/>
+        </w:rPr>
         <w:drawing>
           <wp:inline distT="0" distB="0" distL="0" distR="0" wp14:anchorId="517E4BC8" wp14:editId="0B5EDA55">
             <wp:extent cx="4936274" cy="1409062"/>
@@ -38472,6 +40654,9 @@
     </w:p>
     <w:p>
       <w:r>
+        <w:rPr>
+          <w:noProof/>
+        </w:rPr>
         <w:drawing>
           <wp:inline distT="0" distB="0" distL="0" distR="0" wp14:anchorId="3132E51D" wp14:editId="78E4B656">
             <wp:extent cx="6188710" cy="1963420"/>
@@ -38525,6 +40710,9 @@
     </w:p>
     <w:p>
       <w:r>
+        <w:rPr>
+          <w:noProof/>
+        </w:rPr>
         <w:lastRenderedPageBreak/>
         <w:drawing>
           <wp:inline distT="0" distB="0" distL="0" distR="0" wp14:anchorId="02295A8D" wp14:editId="6E0029C3">
@@ -51201,7 +53389,7 @@
       <w:rPr>
         <w:noProof/>
       </w:rPr>
-      <w:t>28/02/2026</w:t>
+      <w:t>13/03/2026</w:t>
     </w:r>
     <w:r>
       <w:fldChar w:fldCharType="end"/>

</xml_diff>